<commit_message>
Note: Do your Work
</commit_message>
<xml_diff>
--- a/CPMS/CPMS-Project Documentation.docx
+++ b/CPMS/CPMS-Project Documentation.docx
@@ -2,6 +2,15 @@
 <file path=word/document.xml><?xml version="1.0" encoding="utf-8"?>
 <w:document xmlns:wpc="http://schemas.microsoft.com/office/word/2010/wordprocessingCanvas" xmlns:cx="http://schemas.microsoft.com/office/drawing/2014/chartex" xmlns:cx1="http://schemas.microsoft.com/office/drawing/2015/9/8/chartex" xmlns:cx2="http://schemas.microsoft.com/office/drawing/2015/10/21/chartex" xmlns:cx3="http://schemas.microsoft.com/office/drawing/2016/5/9/chartex" xmlns:cx4="http://schemas.microsoft.com/office/drawing/2016/5/10/chartex" xmlns:cx5="http://schemas.microsoft.com/office/drawing/2016/5/11/chartex" xmlns:cx6="http://schemas.microsoft.com/office/drawing/2016/5/12/chartex" xmlns:cx7="http://schemas.microsoft.com/office/drawing/2016/5/13/chartex" xmlns:cx8="http://schemas.microsoft.com/office/drawing/2016/5/14/chartex" xmlns:mc="http://schemas.openxmlformats.org/markup-compatibility/2006" xmlns:aink="http://schemas.microsoft.com/office/drawing/2016/ink" xmlns:am3d="http://schemas.microsoft.com/office/drawing/2017/model3d" xmlns:o="urn:schemas-microsoft-com:office:office" xmlns:oel="http://schemas.microsoft.com/office/2019/extlst" xmlns:r="http://schemas.openxmlformats.org/officeDocument/2006/relationships" xmlns:m="http://schemas.openxmlformats.org/officeDocument/2006/math" xmlns:v="urn:schemas-microsoft-com:vml" xmlns:wp14="http://schemas.microsoft.com/office/word/2010/wordprocessingDrawing" xmlns:wp="http://schemas.openxmlformats.org/drawingml/2006/wordprocessingDrawing" xmlns:w10="urn:schemas-microsoft-com:office:word" xmlns:w="http://schemas.openxmlformats.org/wordprocessingml/2006/main" xmlns:w14="http://schemas.microsoft.com/office/word/2010/wordml" xmlns:w15="http://schemas.microsoft.com/office/word/2012/wordml" xmlns:w16cex="http://schemas.microsoft.com/office/word/2018/wordml/cex" xmlns:w16cid="http://schemas.microsoft.com/office/word/2016/wordml/cid" xmlns:w16="http://schemas.microsoft.com/office/word/2018/wordml" xmlns:w16du="http://schemas.microsoft.com/office/word/2023/wordml/word16du" xmlns:w16sdtdh="http://schemas.microsoft.com/office/word/2020/wordml/sdtdatahash" xmlns:w16sdtfl="http://schemas.microsoft.com/office/word/2024/wordml/sdtformatlock" xmlns:w16se="http://schemas.microsoft.com/office/word/2015/wordml/symex" xmlns:wpg="http://schemas.microsoft.com/office/word/2010/wordprocessingGroup" xmlns:wpi="http://schemas.microsoft.com/office/word/2010/wordprocessingInk" xmlns:wne="http://schemas.microsoft.com/office/word/2006/wordml" xmlns:wps="http://schemas.microsoft.com/office/word/2010/wordprocessingShape" mc:Ignorable="w14 w15 w16se w16cid w16 w16cex w16sdtdh w16sdtfl w16du wp14">
   <w:body>
+    <w:p>
+      <w:pPr>
+        <w:pStyle w:val="Title"/>
+        <w:jc w:val="center"/>
+        <w:rPr>
+          <w:u w:val="single"/>
+        </w:rPr>
+      </w:pPr>
+    </w:p>
     <w:p>
       <w:pPr>
         <w:pStyle w:val="Title"/>
@@ -933,16 +942,7 @@
                 <w:color w:val="FFFFFF"/>
                 <w:sz w:val="32"/>
               </w:rPr>
-              <w:t>CP</w:t>
-            </w:r>
-            <w:r>
-              <w:rPr>
-                <w:rFonts w:ascii="Calibri" w:eastAsia="Calibri" w:hAnsi="Calibri" w:cs="Calibri"/>
-                <w:b/>
-                <w:color w:val="FFFFFF"/>
-                <w:sz w:val="32"/>
-              </w:rPr>
-              <w:t>M_Role</w:t>
+              <w:t>CPM_Role</w:t>
             </w:r>
             <w:proofErr w:type="spellEnd"/>
             <w:r>
@@ -1501,10 +1501,7 @@
           </w:tcPr>
           <w:p>
             <w:r>
-              <w:t>Not Null</w:t>
-            </w:r>
-            <w:r>
-              <w:t>, Unique</w:t>
+              <w:t>Not Null, Unique</w:t>
             </w:r>
           </w:p>
         </w:tc>
@@ -2053,7 +2050,6 @@
         <w:tblCellMar>
           <w:top w:w="73" w:type="dxa"/>
           <w:left w:w="108" w:type="dxa"/>
-          <w:bottom w:w="0" w:type="dxa"/>
           <w:right w:w="115" w:type="dxa"/>
         </w:tblCellMar>
         <w:tblLook w:val="04A0" w:firstRow="1" w:lastRow="0" w:firstColumn="1" w:lastColumn="0" w:noHBand="0" w:noVBand="1"/>
@@ -2385,13 +2381,7 @@
               <w:spacing w:line="259" w:lineRule="auto"/>
             </w:pPr>
             <w:r>
-              <w:t xml:space="preserve">Not Null, FK </w:t>
-            </w:r>
-            <w:r>
-              <w:t xml:space="preserve">→ </w:t>
-            </w:r>
-            <w:r>
-              <w:t>University</w:t>
+              <w:t>Not Null, FK → University</w:t>
             </w:r>
           </w:p>
         </w:tc>
@@ -3455,13 +3445,7 @@
           </w:tcPr>
           <w:p>
             <w:r>
-              <w:t xml:space="preserve">Not Null, </w:t>
-            </w:r>
-            <w:r>
-              <w:t>FK →</w:t>
-            </w:r>
-            <w:r>
-              <w:t xml:space="preserve"> University</w:t>
+              <w:t>Not Null, FK → University</w:t>
             </w:r>
           </w:p>
         </w:tc>
@@ -3588,13 +3572,7 @@
               <w:t>Not Null</w:t>
             </w:r>
             <w:r>
-              <w:t xml:space="preserve">, </w:t>
-            </w:r>
-            <w:r>
-              <w:t>FK →</w:t>
-            </w:r>
-            <w:r>
-              <w:t xml:space="preserve"> Department</w:t>
+              <w:t>, FK → Department</w:t>
             </w:r>
           </w:p>
         </w:tc>
@@ -3652,13 +3630,7 @@
               <w:t>Not Null</w:t>
             </w:r>
             <w:r>
-              <w:t xml:space="preserve">, </w:t>
-            </w:r>
-            <w:r>
-              <w:t>FK →</w:t>
-            </w:r>
-            <w:r>
-              <w:t xml:space="preserve"> Course</w:t>
+              <w:t>, FK → Course</w:t>
             </w:r>
           </w:p>
         </w:tc>
@@ -4202,7 +4174,6 @@
         <w:tblCellMar>
           <w:top w:w="96" w:type="dxa"/>
           <w:left w:w="106" w:type="dxa"/>
-          <w:bottom w:w="0" w:type="dxa"/>
           <w:right w:w="115" w:type="dxa"/>
         </w:tblCellMar>
         <w:tblLook w:val="04A0" w:firstRow="1" w:lastRow="0" w:firstColumn="1" w:lastColumn="0" w:noHBand="0" w:noVBand="1"/>
@@ -4239,16 +4210,7 @@
                 <w:color w:val="FFFFFF"/>
                 <w:sz w:val="32"/>
               </w:rPr>
-              <w:t>SPM_</w:t>
-            </w:r>
-            <w:r>
-              <w:rPr>
-                <w:rFonts w:ascii="Calibri" w:eastAsia="Calibri" w:hAnsi="Calibri" w:cs="Calibri"/>
-                <w:b/>
-                <w:color w:val="FFFFFF"/>
-                <w:sz w:val="32"/>
-              </w:rPr>
-              <w:t>Department</w:t>
+              <w:t>SPM_Department</w:t>
             </w:r>
             <w:proofErr w:type="spellEnd"/>
           </w:p>
@@ -4511,10 +4473,7 @@
               <w:ind w:left="2"/>
             </w:pPr>
             <w:r>
-              <w:t xml:space="preserve">Not Null, FK → </w:t>
-            </w:r>
-            <w:r>
-              <w:t>University</w:t>
+              <w:t>Not Null, FK → University</w:t>
             </w:r>
           </w:p>
         </w:tc>
@@ -4889,10 +4848,7 @@
               <w:ind w:left="2"/>
             </w:pPr>
             <w:r>
-              <w:t xml:space="preserve">Not Null, FK → </w:t>
-            </w:r>
-            <w:r>
-              <w:t>University</w:t>
+              <w:t>Not Null, FK → University</w:t>
             </w:r>
             <w:r>
               <w:rPr>
@@ -5020,16 +4976,7 @@
                 <w:color w:val="FFFFFF"/>
                 <w:sz w:val="32"/>
               </w:rPr>
-              <w:t>CPM_</w:t>
-            </w:r>
-            <w:r>
-              <w:rPr>
-                <w:rFonts w:ascii="Calibri" w:eastAsia="Calibri" w:hAnsi="Calibri" w:cs="Calibri"/>
-                <w:b/>
-                <w:color w:val="FFFFFF"/>
-                <w:sz w:val="32"/>
-              </w:rPr>
-              <w:t>Companies</w:t>
+              <w:t>CPM_Companies</w:t>
             </w:r>
             <w:proofErr w:type="spellEnd"/>
           </w:p>
@@ -5604,10 +5551,7 @@
           </w:tcPr>
           <w:p>
             <w:r>
-              <w:t>Not Null</w:t>
-            </w:r>
-            <w:r>
-              <w:t>, Unique</w:t>
+              <w:t>Not Null, Unique</w:t>
             </w:r>
           </w:p>
         </w:tc>
@@ -5664,10 +5608,7 @@
           </w:tcPr>
           <w:p>
             <w:r>
-              <w:t>Not Null</w:t>
-            </w:r>
-            <w:r>
-              <w:t>, Unique</w:t>
+              <w:t>Not Null, Unique</w:t>
             </w:r>
           </w:p>
         </w:tc>
@@ -5839,7 +5780,6 @@
         <w:tblCellMar>
           <w:top w:w="96" w:type="dxa"/>
           <w:left w:w="106" w:type="dxa"/>
-          <w:bottom w:w="0" w:type="dxa"/>
           <w:right w:w="115" w:type="dxa"/>
         </w:tblCellMar>
         <w:tblLook w:val="04A0" w:firstRow="1" w:lastRow="0" w:firstColumn="1" w:lastColumn="0" w:noHBand="0" w:noVBand="1"/>
@@ -6153,10 +6093,7 @@
               <w:ind w:left="2"/>
             </w:pPr>
             <w:r>
-              <w:t xml:space="preserve">Not Null, FK → </w:t>
-            </w:r>
-            <w:r>
-              <w:t>User</w:t>
+              <w:t>Not Null, FK → User</w:t>
             </w:r>
           </w:p>
         </w:tc>
@@ -6227,10 +6164,7 @@
               <w:ind w:left="2"/>
             </w:pPr>
             <w:r>
-              <w:t>Not Null</w:t>
-            </w:r>
-            <w:r>
-              <w:t xml:space="preserve">, </w:t>
+              <w:t xml:space="preserve">Not Null, </w:t>
             </w:r>
             <w:r>
               <w:t>FK →</w:t>
@@ -6590,13 +6524,7 @@
               <w:t>Not Null</w:t>
             </w:r>
             <w:r>
-              <w:t xml:space="preserve">, </w:t>
-            </w:r>
-            <w:r>
-              <w:t>FK →</w:t>
-            </w:r>
-            <w:r>
-              <w:t xml:space="preserve"> University</w:t>
+              <w:t>, FK → University</w:t>
             </w:r>
           </w:p>
         </w:tc>
@@ -6659,13 +6587,7 @@
               <w:t>Not Null</w:t>
             </w:r>
             <w:r>
-              <w:t xml:space="preserve">, </w:t>
-            </w:r>
-            <w:r>
-              <w:t>FK →</w:t>
-            </w:r>
-            <w:r>
-              <w:t xml:space="preserve"> Companies</w:t>
+              <w:t>, FK → Companies</w:t>
             </w:r>
           </w:p>
         </w:tc>
@@ -11287,6 +11209,7 @@
   <w:style w:type="character" w:default="1" w:styleId="DefaultParagraphFont">
     <w:name w:val="Default Paragraph Font"/>
     <w:uiPriority w:val="1"/>
+    <w:semiHidden/>
     <w:unhideWhenUsed/>
   </w:style>
   <w:style w:type="table" w:default="1" w:styleId="TableNormal">

</xml_diff>

<commit_message>
GT  Lab-5 friend networking
</commit_message>
<xml_diff>
--- a/CPMS/CPMS-Project Documentation.docx
+++ b/CPMS/CPMS-Project Documentation.docx
@@ -1612,7 +1612,10 @@
           </w:tcPr>
           <w:p>
             <w:r>
-              <w:t>Not Null</w:t>
+              <w:t xml:space="preserve">Allow </w:t>
+            </w:r>
+            <w:r>
+              <w:t>Null</w:t>
             </w:r>
           </w:p>
         </w:tc>
@@ -1667,117 +1670,10 @@
           </w:tcPr>
           <w:p>
             <w:r>
-              <w:t>Not Null</w:t>
-            </w:r>
-          </w:p>
-        </w:tc>
-      </w:tr>
-      <w:tr>
-        <w:trPr>
-          <w:trHeight w:val="348"/>
-        </w:trPr>
-        <w:tc>
-          <w:tcPr>
-            <w:tcW w:w="2730" w:type="dxa"/>
-            <w:tcBorders>
-              <w:top w:val="single" w:sz="4" w:space="0" w:color="000000"/>
-              <w:left w:val="single" w:sz="4" w:space="0" w:color="000000"/>
-              <w:bottom w:val="single" w:sz="4" w:space="0" w:color="000000"/>
-              <w:right w:val="single" w:sz="4" w:space="0" w:color="000000"/>
-            </w:tcBorders>
-            <w:vAlign w:val="center"/>
-          </w:tcPr>
-          <w:p>
-            <w:r>
-              <w:t>City</w:t>
-            </w:r>
-          </w:p>
-        </w:tc>
-        <w:tc>
-          <w:tcPr>
-            <w:tcW w:w="3005" w:type="dxa"/>
-            <w:tcBorders>
-              <w:top w:val="single" w:sz="4" w:space="0" w:color="000000"/>
-              <w:left w:val="single" w:sz="4" w:space="0" w:color="000000"/>
-              <w:bottom w:val="single" w:sz="4" w:space="0" w:color="000000"/>
-              <w:right w:val="single" w:sz="4" w:space="0" w:color="000000"/>
-            </w:tcBorders>
-            <w:vAlign w:val="center"/>
-          </w:tcPr>
-          <w:p>
-            <w:r>
-              <w:t>varchar</w:t>
-            </w:r>
-          </w:p>
-        </w:tc>
-        <w:tc>
-          <w:tcPr>
-            <w:tcW w:w="3483" w:type="dxa"/>
-            <w:tcBorders>
-              <w:top w:val="single" w:sz="4" w:space="0" w:color="000000"/>
-              <w:left w:val="single" w:sz="4" w:space="0" w:color="000000"/>
-              <w:bottom w:val="single" w:sz="4" w:space="0" w:color="000000"/>
-              <w:right w:val="single" w:sz="4" w:space="0" w:color="000000"/>
-            </w:tcBorders>
-          </w:tcPr>
-          <w:p>
-            <w:r>
-              <w:t>Not Null</w:t>
-            </w:r>
-          </w:p>
-        </w:tc>
-      </w:tr>
-      <w:tr>
-        <w:trPr>
-          <w:trHeight w:val="348"/>
-        </w:trPr>
-        <w:tc>
-          <w:tcPr>
-            <w:tcW w:w="2730" w:type="dxa"/>
-            <w:tcBorders>
-              <w:top w:val="single" w:sz="4" w:space="0" w:color="000000"/>
-              <w:left w:val="single" w:sz="4" w:space="0" w:color="000000"/>
-              <w:bottom w:val="single" w:sz="4" w:space="0" w:color="000000"/>
-              <w:right w:val="single" w:sz="4" w:space="0" w:color="000000"/>
-            </w:tcBorders>
-            <w:vAlign w:val="center"/>
-          </w:tcPr>
-          <w:p>
-            <w:r>
-              <w:t>State</w:t>
-            </w:r>
-          </w:p>
-        </w:tc>
-        <w:tc>
-          <w:tcPr>
-            <w:tcW w:w="3005" w:type="dxa"/>
-            <w:tcBorders>
-              <w:top w:val="single" w:sz="4" w:space="0" w:color="000000"/>
-              <w:left w:val="single" w:sz="4" w:space="0" w:color="000000"/>
-              <w:bottom w:val="single" w:sz="4" w:space="0" w:color="000000"/>
-              <w:right w:val="single" w:sz="4" w:space="0" w:color="000000"/>
-            </w:tcBorders>
-            <w:vAlign w:val="center"/>
-          </w:tcPr>
-          <w:p>
-            <w:r>
-              <w:t>varchar</w:t>
-            </w:r>
-          </w:p>
-        </w:tc>
-        <w:tc>
-          <w:tcPr>
-            <w:tcW w:w="3483" w:type="dxa"/>
-            <w:tcBorders>
-              <w:top w:val="single" w:sz="4" w:space="0" w:color="000000"/>
-              <w:left w:val="single" w:sz="4" w:space="0" w:color="000000"/>
-              <w:bottom w:val="single" w:sz="4" w:space="0" w:color="000000"/>
-              <w:right w:val="single" w:sz="4" w:space="0" w:color="000000"/>
-            </w:tcBorders>
-          </w:tcPr>
-          <w:p>
-            <w:r>
-              <w:t>Allow Null</w:t>
+              <w:t>Allow</w:t>
+            </w:r>
+            <w:r>
+              <w:t xml:space="preserve"> Null</w:t>
             </w:r>
           </w:p>
         </w:tc>
@@ -5267,7 +5163,7 @@
       </w:tr>
       <w:tr>
         <w:trPr>
-          <w:trHeight w:val="346"/>
+          <w:trHeight w:val="348"/>
         </w:trPr>
         <w:tc>
           <w:tcPr>
@@ -5279,11 +5175,10 @@
               <w:right w:val="single" w:sz="4" w:space="0" w:color="000000"/>
             </w:tcBorders>
             <w:vAlign w:val="center"/>
-            <w:hideMark/>
-          </w:tcPr>
-          <w:p>
-            <w:r>
-              <w:t>Industry</w:t>
+          </w:tcPr>
+          <w:p>
+            <w:r>
+              <w:t>Email</w:t>
             </w:r>
           </w:p>
         </w:tc>
@@ -5297,7 +5192,6 @@
               <w:right w:val="single" w:sz="4" w:space="0" w:color="000000"/>
             </w:tcBorders>
             <w:vAlign w:val="center"/>
-            <w:hideMark/>
           </w:tcPr>
           <w:p>
             <w:r>
@@ -5314,17 +5208,10 @@
               <w:bottom w:val="single" w:sz="4" w:space="0" w:color="000000"/>
               <w:right w:val="single" w:sz="4" w:space="0" w:color="000000"/>
             </w:tcBorders>
-            <w:hideMark/>
-          </w:tcPr>
-          <w:p>
-            <w:r>
-              <w:t>Not Null</w:t>
-            </w:r>
-            <w:r>
-              <w:rPr>
-                <w:b/>
-              </w:rPr>
-              <w:t xml:space="preserve"> </w:t>
+          </w:tcPr>
+          <w:p>
+            <w:r>
+              <w:t>Not Null, Unique</w:t>
             </w:r>
           </w:p>
         </w:tc>
@@ -5343,238 +5230,11 @@
               <w:right w:val="single" w:sz="4" w:space="0" w:color="000000"/>
             </w:tcBorders>
             <w:vAlign w:val="center"/>
-            <w:hideMark/>
-          </w:tcPr>
-          <w:p>
-            <w:r>
-              <w:t>Location</w:t>
-            </w:r>
-          </w:p>
-        </w:tc>
-        <w:tc>
-          <w:tcPr>
-            <w:tcW w:w="3005" w:type="dxa"/>
-            <w:tcBorders>
-              <w:top w:val="single" w:sz="4" w:space="0" w:color="000000"/>
-              <w:left w:val="single" w:sz="4" w:space="0" w:color="000000"/>
-              <w:bottom w:val="single" w:sz="4" w:space="0" w:color="000000"/>
-              <w:right w:val="single" w:sz="4" w:space="0" w:color="000000"/>
-            </w:tcBorders>
-            <w:vAlign w:val="center"/>
-            <w:hideMark/>
-          </w:tcPr>
-          <w:p>
-            <w:r>
-              <w:t>varchar</w:t>
-            </w:r>
-          </w:p>
-        </w:tc>
-        <w:tc>
-          <w:tcPr>
-            <w:tcW w:w="3483" w:type="dxa"/>
-            <w:tcBorders>
-              <w:top w:val="single" w:sz="4" w:space="0" w:color="000000"/>
-              <w:left w:val="single" w:sz="4" w:space="0" w:color="000000"/>
-              <w:bottom w:val="single" w:sz="4" w:space="0" w:color="000000"/>
-              <w:right w:val="single" w:sz="4" w:space="0" w:color="000000"/>
-            </w:tcBorders>
-            <w:hideMark/>
-          </w:tcPr>
-          <w:p>
-            <w:r>
-              <w:t>Not Null</w:t>
-            </w:r>
-          </w:p>
-        </w:tc>
-      </w:tr>
-      <w:tr>
-        <w:trPr>
-          <w:trHeight w:val="348"/>
-        </w:trPr>
-        <w:tc>
-          <w:tcPr>
-            <w:tcW w:w="2730" w:type="dxa"/>
-            <w:tcBorders>
-              <w:top w:val="single" w:sz="4" w:space="0" w:color="000000"/>
-              <w:left w:val="single" w:sz="4" w:space="0" w:color="000000"/>
-              <w:bottom w:val="single" w:sz="4" w:space="0" w:color="000000"/>
-              <w:right w:val="single" w:sz="4" w:space="0" w:color="000000"/>
-            </w:tcBorders>
-            <w:vAlign w:val="center"/>
-          </w:tcPr>
-          <w:p>
-            <w:r>
-              <w:t>Description</w:t>
-            </w:r>
-          </w:p>
-        </w:tc>
-        <w:tc>
-          <w:tcPr>
-            <w:tcW w:w="3005" w:type="dxa"/>
-            <w:tcBorders>
-              <w:top w:val="single" w:sz="4" w:space="0" w:color="000000"/>
-              <w:left w:val="single" w:sz="4" w:space="0" w:color="000000"/>
-              <w:bottom w:val="single" w:sz="4" w:space="0" w:color="000000"/>
-              <w:right w:val="single" w:sz="4" w:space="0" w:color="000000"/>
-            </w:tcBorders>
-            <w:vAlign w:val="center"/>
-          </w:tcPr>
-          <w:p>
-            <w:r>
-              <w:t>text</w:t>
-            </w:r>
-          </w:p>
-        </w:tc>
-        <w:tc>
-          <w:tcPr>
-            <w:tcW w:w="3483" w:type="dxa"/>
-            <w:tcBorders>
-              <w:top w:val="single" w:sz="4" w:space="0" w:color="000000"/>
-              <w:left w:val="single" w:sz="4" w:space="0" w:color="000000"/>
-              <w:bottom w:val="single" w:sz="4" w:space="0" w:color="000000"/>
-              <w:right w:val="single" w:sz="4" w:space="0" w:color="000000"/>
-            </w:tcBorders>
-          </w:tcPr>
-          <w:p>
-            <w:r>
-              <w:t>Not Null</w:t>
-            </w:r>
-          </w:p>
-        </w:tc>
-      </w:tr>
-      <w:tr>
-        <w:trPr>
-          <w:trHeight w:val="348"/>
-        </w:trPr>
-        <w:tc>
-          <w:tcPr>
-            <w:tcW w:w="2730" w:type="dxa"/>
-            <w:tcBorders>
-              <w:top w:val="single" w:sz="4" w:space="0" w:color="000000"/>
-              <w:left w:val="single" w:sz="4" w:space="0" w:color="000000"/>
-              <w:bottom w:val="single" w:sz="4" w:space="0" w:color="000000"/>
-              <w:right w:val="single" w:sz="4" w:space="0" w:color="000000"/>
-            </w:tcBorders>
-            <w:vAlign w:val="center"/>
           </w:tcPr>
           <w:p>
             <w:proofErr w:type="spellStart"/>
             <w:r>
-              <w:t>HRName</w:t>
-            </w:r>
-            <w:proofErr w:type="spellEnd"/>
-          </w:p>
-        </w:tc>
-        <w:tc>
-          <w:tcPr>
-            <w:tcW w:w="3005" w:type="dxa"/>
-            <w:tcBorders>
-              <w:top w:val="single" w:sz="4" w:space="0" w:color="000000"/>
-              <w:left w:val="single" w:sz="4" w:space="0" w:color="000000"/>
-              <w:bottom w:val="single" w:sz="4" w:space="0" w:color="000000"/>
-              <w:right w:val="single" w:sz="4" w:space="0" w:color="000000"/>
-            </w:tcBorders>
-            <w:vAlign w:val="center"/>
-          </w:tcPr>
-          <w:p>
-            <w:r>
-              <w:t>varchar</w:t>
-            </w:r>
-          </w:p>
-        </w:tc>
-        <w:tc>
-          <w:tcPr>
-            <w:tcW w:w="3483" w:type="dxa"/>
-            <w:tcBorders>
-              <w:top w:val="single" w:sz="4" w:space="0" w:color="000000"/>
-              <w:left w:val="single" w:sz="4" w:space="0" w:color="000000"/>
-              <w:bottom w:val="single" w:sz="4" w:space="0" w:color="000000"/>
-              <w:right w:val="single" w:sz="4" w:space="0" w:color="000000"/>
-            </w:tcBorders>
-          </w:tcPr>
-          <w:p>
-            <w:r>
-              <w:t>Not Null</w:t>
-            </w:r>
-          </w:p>
-        </w:tc>
-      </w:tr>
-      <w:tr>
-        <w:trPr>
-          <w:trHeight w:val="348"/>
-        </w:trPr>
-        <w:tc>
-          <w:tcPr>
-            <w:tcW w:w="2730" w:type="dxa"/>
-            <w:tcBorders>
-              <w:top w:val="single" w:sz="4" w:space="0" w:color="000000"/>
-              <w:left w:val="single" w:sz="4" w:space="0" w:color="000000"/>
-              <w:bottom w:val="single" w:sz="4" w:space="0" w:color="000000"/>
-              <w:right w:val="single" w:sz="4" w:space="0" w:color="000000"/>
-            </w:tcBorders>
-            <w:vAlign w:val="center"/>
-          </w:tcPr>
-          <w:p>
-            <w:proofErr w:type="spellStart"/>
-            <w:r>
-              <w:t>HREmail</w:t>
-            </w:r>
-            <w:proofErr w:type="spellEnd"/>
-          </w:p>
-        </w:tc>
-        <w:tc>
-          <w:tcPr>
-            <w:tcW w:w="3005" w:type="dxa"/>
-            <w:tcBorders>
-              <w:top w:val="single" w:sz="4" w:space="0" w:color="000000"/>
-              <w:left w:val="single" w:sz="4" w:space="0" w:color="000000"/>
-              <w:bottom w:val="single" w:sz="4" w:space="0" w:color="000000"/>
-              <w:right w:val="single" w:sz="4" w:space="0" w:color="000000"/>
-            </w:tcBorders>
-            <w:vAlign w:val="center"/>
-          </w:tcPr>
-          <w:p>
-            <w:r>
-              <w:t>varchar</w:t>
-            </w:r>
-          </w:p>
-        </w:tc>
-        <w:tc>
-          <w:tcPr>
-            <w:tcW w:w="3483" w:type="dxa"/>
-            <w:tcBorders>
-              <w:top w:val="single" w:sz="4" w:space="0" w:color="000000"/>
-              <w:left w:val="single" w:sz="4" w:space="0" w:color="000000"/>
-              <w:bottom w:val="single" w:sz="4" w:space="0" w:color="000000"/>
-              <w:right w:val="single" w:sz="4" w:space="0" w:color="000000"/>
-            </w:tcBorders>
-          </w:tcPr>
-          <w:p>
-            <w:r>
-              <w:t>Not Null, Unique</w:t>
-            </w:r>
-          </w:p>
-        </w:tc>
-      </w:tr>
-      <w:tr>
-        <w:trPr>
-          <w:trHeight w:val="348"/>
-        </w:trPr>
-        <w:tc>
-          <w:tcPr>
-            <w:tcW w:w="2730" w:type="dxa"/>
-            <w:tcBorders>
-              <w:top w:val="single" w:sz="4" w:space="0" w:color="000000"/>
-              <w:left w:val="single" w:sz="4" w:space="0" w:color="000000"/>
-              <w:bottom w:val="single" w:sz="4" w:space="0" w:color="000000"/>
-              <w:right w:val="single" w:sz="4" w:space="0" w:color="000000"/>
-            </w:tcBorders>
-            <w:vAlign w:val="center"/>
-          </w:tcPr>
-          <w:p>
-            <w:proofErr w:type="spellStart"/>
-            <w:r>
-              <w:t>HRPhone</w:t>
+              <w:t>MobileNumber</w:t>
             </w:r>
             <w:proofErr w:type="spellEnd"/>
           </w:p>
@@ -5772,42 +5432,39 @@
         <w:br w:type="page"/>
       </w:r>
     </w:p>
+    <w:p/>
     <w:tbl>
       <w:tblPr>
-        <w:tblStyle w:val="TableGrid0"/>
-        <w:tblW w:w="9214" w:type="dxa"/>
-        <w:tblInd w:w="314" w:type="dxa"/>
+        <w:tblW w:w="9218" w:type="dxa"/>
+        <w:tblInd w:w="312" w:type="dxa"/>
         <w:tblCellMar>
-          <w:top w:w="96" w:type="dxa"/>
-          <w:left w:w="106" w:type="dxa"/>
+          <w:top w:w="73" w:type="dxa"/>
           <w:right w:w="115" w:type="dxa"/>
         </w:tblCellMar>
         <w:tblLook w:val="04A0" w:firstRow="1" w:lastRow="0" w:firstColumn="1" w:lastColumn="0" w:noHBand="0" w:noVBand="1"/>
       </w:tblPr>
       <w:tblGrid>
-        <w:gridCol w:w="4355"/>
-        <w:gridCol w:w="2294"/>
-        <w:gridCol w:w="2565"/>
+        <w:gridCol w:w="3236"/>
+        <w:gridCol w:w="2772"/>
+        <w:gridCol w:w="3210"/>
       </w:tblGrid>
       <w:tr>
         <w:trPr>
-          <w:trHeight w:val="460"/>
+          <w:trHeight w:val="452"/>
         </w:trPr>
         <w:tc>
           <w:tcPr>
-            <w:tcW w:w="4355" w:type="dxa"/>
-            <w:tcBorders>
-              <w:top w:val="single" w:sz="23" w:space="0" w:color="000000"/>
-              <w:left w:val="single" w:sz="4" w:space="0" w:color="000000"/>
-              <w:bottom w:val="single" w:sz="4" w:space="0" w:color="000000"/>
+            <w:tcW w:w="3236" w:type="dxa"/>
+            <w:tcBorders>
+              <w:top w:val="single" w:sz="18" w:space="0" w:color="000000"/>
+              <w:left w:val="nil"/>
+              <w:bottom w:val="nil"/>
               <w:right w:val="nil"/>
             </w:tcBorders>
             <w:shd w:val="clear" w:color="auto" w:fill="000000"/>
-          </w:tcPr>
-          <w:p>
-            <w:pPr>
-              <w:spacing w:line="259" w:lineRule="auto"/>
-            </w:pPr>
+            <w:hideMark/>
+          </w:tcPr>
+          <w:p>
             <w:proofErr w:type="spellStart"/>
             <w:r>
               <w:rPr>
@@ -5816,8 +5473,7 @@
                 <w:color w:val="FFFFFF"/>
                 <w:sz w:val="32"/>
               </w:rPr>
-              <w:lastRenderedPageBreak/>
-              <w:t>SPM_</w:t>
+              <w:t>CPM_</w:t>
             </w:r>
             <w:r>
               <w:rPr>
@@ -5826,65 +5482,65 @@
                 <w:color w:val="FFFFFF"/>
                 <w:sz w:val="32"/>
               </w:rPr>
-              <w:t>CompanyRepresentatives</w:t>
+              <w:t>PlacementDrives</w:t>
             </w:r>
             <w:proofErr w:type="spellEnd"/>
           </w:p>
         </w:tc>
         <w:tc>
           <w:tcPr>
-            <w:tcW w:w="2294" w:type="dxa"/>
-            <w:tcBorders>
-              <w:top w:val="single" w:sz="23" w:space="0" w:color="000000"/>
+            <w:tcW w:w="2772" w:type="dxa"/>
+            <w:tcBorders>
+              <w:top w:val="single" w:sz="18" w:space="0" w:color="000000"/>
               <w:left w:val="nil"/>
-              <w:bottom w:val="single" w:sz="4" w:space="0" w:color="000000"/>
+              <w:bottom w:val="nil"/>
               <w:right w:val="nil"/>
             </w:tcBorders>
             <w:shd w:val="clear" w:color="auto" w:fill="000000"/>
-          </w:tcPr>
-          <w:p>
-            <w:pPr>
-              <w:spacing w:after="160" w:line="259" w:lineRule="auto"/>
-            </w:pPr>
-          </w:p>
-        </w:tc>
-        <w:tc>
-          <w:tcPr>
-            <w:tcW w:w="2565" w:type="dxa"/>
-            <w:tcBorders>
-              <w:top w:val="single" w:sz="23" w:space="0" w:color="000000"/>
+            <w:hideMark/>
+          </w:tcPr>
+          <w:p>
+            <w:r>
+              <w:t xml:space="preserve"> </w:t>
+            </w:r>
+          </w:p>
+        </w:tc>
+        <w:tc>
+          <w:tcPr>
+            <w:tcW w:w="3210" w:type="dxa"/>
+            <w:tcBorders>
+              <w:top w:val="single" w:sz="18" w:space="0" w:color="000000"/>
               <w:left w:val="nil"/>
-              <w:bottom w:val="single" w:sz="4" w:space="0" w:color="000000"/>
-              <w:right w:val="single" w:sz="4" w:space="0" w:color="000000"/>
+              <w:bottom w:val="nil"/>
+              <w:right w:val="nil"/>
             </w:tcBorders>
             <w:shd w:val="clear" w:color="auto" w:fill="000000"/>
-          </w:tcPr>
-          <w:p>
-            <w:pPr>
-              <w:spacing w:after="160" w:line="259" w:lineRule="auto"/>
-            </w:pPr>
+            <w:hideMark/>
+          </w:tcPr>
+          <w:p>
+            <w:r>
+              <w:t xml:space="preserve"> </w:t>
+            </w:r>
           </w:p>
         </w:tc>
       </w:tr>
       <w:tr>
         <w:trPr>
-          <w:trHeight w:val="349"/>
+          <w:trHeight w:val="370"/>
         </w:trPr>
         <w:tc>
           <w:tcPr>
-            <w:tcW w:w="4355" w:type="dxa"/>
-            <w:tcBorders>
-              <w:top w:val="single" w:sz="4" w:space="0" w:color="000000"/>
-              <w:left w:val="single" w:sz="4" w:space="0" w:color="000000"/>
-              <w:bottom w:val="single" w:sz="4" w:space="0" w:color="000000"/>
-              <w:right w:val="single" w:sz="4" w:space="0" w:color="000000"/>
-            </w:tcBorders>
-            <w:vAlign w:val="center"/>
-          </w:tcPr>
-          <w:p>
-            <w:pPr>
-              <w:spacing w:line="259" w:lineRule="auto"/>
-            </w:pPr>
+            <w:tcW w:w="3236" w:type="dxa"/>
+            <w:tcBorders>
+              <w:top w:val="nil"/>
+              <w:left w:val="single" w:sz="4" w:space="0" w:color="000000"/>
+              <w:bottom w:val="single" w:sz="4" w:space="0" w:color="000000"/>
+              <w:right w:val="single" w:sz="4" w:space="0" w:color="000000"/>
+            </w:tcBorders>
+            <w:vAlign w:val="center"/>
+            <w:hideMark/>
+          </w:tcPr>
+          <w:p>
             <w:r>
               <w:rPr>
                 <w:b/>
@@ -5896,20 +5552,17 @@
         </w:tc>
         <w:tc>
           <w:tcPr>
-            <w:tcW w:w="2294" w:type="dxa"/>
-            <w:tcBorders>
-              <w:top w:val="single" w:sz="4" w:space="0" w:color="000000"/>
-              <w:left w:val="single" w:sz="4" w:space="0" w:color="000000"/>
-              <w:bottom w:val="single" w:sz="4" w:space="0" w:color="000000"/>
-              <w:right w:val="single" w:sz="4" w:space="0" w:color="000000"/>
-            </w:tcBorders>
-            <w:vAlign w:val="center"/>
-          </w:tcPr>
-          <w:p>
-            <w:pPr>
-              <w:spacing w:line="259" w:lineRule="auto"/>
-              <w:ind w:left="5"/>
-            </w:pPr>
+            <w:tcW w:w="2772" w:type="dxa"/>
+            <w:tcBorders>
+              <w:top w:val="nil"/>
+              <w:left w:val="single" w:sz="4" w:space="0" w:color="000000"/>
+              <w:bottom w:val="single" w:sz="4" w:space="0" w:color="000000"/>
+              <w:right w:val="single" w:sz="4" w:space="0" w:color="000000"/>
+            </w:tcBorders>
+            <w:vAlign w:val="center"/>
+            <w:hideMark/>
+          </w:tcPr>
+          <w:p>
             <w:r>
               <w:rPr>
                 <w:b/>
@@ -5921,57 +5574,45 @@
         </w:tc>
         <w:tc>
           <w:tcPr>
-            <w:tcW w:w="2565" w:type="dxa"/>
-            <w:tcBorders>
-              <w:top w:val="single" w:sz="4" w:space="0" w:color="000000"/>
-              <w:left w:val="single" w:sz="4" w:space="0" w:color="000000"/>
-              <w:bottom w:val="single" w:sz="4" w:space="0" w:color="000000"/>
-              <w:right w:val="single" w:sz="4" w:space="0" w:color="000000"/>
-            </w:tcBorders>
-          </w:tcPr>
-          <w:p>
-            <w:pPr>
-              <w:spacing w:line="259" w:lineRule="auto"/>
-              <w:ind w:left="2"/>
-            </w:pPr>
-            <w:r>
-              <w:rPr>
-                <w:rFonts w:ascii="Calibri" w:eastAsia="Calibri" w:hAnsi="Calibri" w:cs="Calibri"/>
+            <w:tcW w:w="3210" w:type="dxa"/>
+            <w:tcBorders>
+              <w:top w:val="nil"/>
+              <w:left w:val="single" w:sz="4" w:space="0" w:color="000000"/>
+              <w:bottom w:val="single" w:sz="4" w:space="0" w:color="000000"/>
+              <w:right w:val="single" w:sz="4" w:space="0" w:color="000000"/>
+            </w:tcBorders>
+            <w:hideMark/>
+          </w:tcPr>
+          <w:p>
+            <w:r>
+              <w:rPr>
                 <w:b/>
               </w:rPr>
-              <w:t xml:space="preserve">Remarks </w:t>
-            </w:r>
-            <w:r>
-              <w:rPr>
-                <w:rFonts w:ascii="Calibri" w:eastAsia="Calibri" w:hAnsi="Calibri" w:cs="Calibri"/>
-              </w:rPr>
-              <w:t xml:space="preserve"> </w:t>
+              <w:t xml:space="preserve">Remarks  </w:t>
             </w:r>
           </w:p>
         </w:tc>
       </w:tr>
       <w:tr>
         <w:trPr>
-          <w:trHeight w:val="349"/>
+          <w:trHeight w:val="351"/>
         </w:trPr>
         <w:tc>
           <w:tcPr>
-            <w:tcW w:w="4355" w:type="dxa"/>
-            <w:tcBorders>
-              <w:top w:val="single" w:sz="4" w:space="0" w:color="000000"/>
-              <w:left w:val="single" w:sz="4" w:space="0" w:color="000000"/>
-              <w:bottom w:val="single" w:sz="4" w:space="0" w:color="000000"/>
-              <w:right w:val="single" w:sz="4" w:space="0" w:color="000000"/>
-            </w:tcBorders>
-            <w:vAlign w:val="center"/>
-          </w:tcPr>
-          <w:p>
-            <w:pPr>
-              <w:spacing w:line="259" w:lineRule="auto"/>
-            </w:pPr>
+            <w:tcW w:w="3236" w:type="dxa"/>
+            <w:tcBorders>
+              <w:top w:val="nil"/>
+              <w:left w:val="single" w:sz="4" w:space="0" w:color="000000"/>
+              <w:bottom w:val="single" w:sz="4" w:space="0" w:color="000000"/>
+              <w:right w:val="single" w:sz="4" w:space="0" w:color="000000"/>
+            </w:tcBorders>
+            <w:vAlign w:val="center"/>
+            <w:hideMark/>
+          </w:tcPr>
+          <w:p>
             <w:proofErr w:type="spellStart"/>
             <w:r>
-              <w:t>RepresentativeId</w:t>
+              <w:t>DriveId</w:t>
             </w:r>
             <w:proofErr w:type="spellEnd"/>
             <w:r>
@@ -5981,20 +5622,17 @@
         </w:tc>
         <w:tc>
           <w:tcPr>
-            <w:tcW w:w="2294" w:type="dxa"/>
-            <w:tcBorders>
-              <w:top w:val="single" w:sz="4" w:space="0" w:color="000000"/>
-              <w:left w:val="single" w:sz="4" w:space="0" w:color="000000"/>
-              <w:bottom w:val="single" w:sz="4" w:space="0" w:color="000000"/>
-              <w:right w:val="single" w:sz="4" w:space="0" w:color="000000"/>
-            </w:tcBorders>
-            <w:vAlign w:val="center"/>
-          </w:tcPr>
-          <w:p>
-            <w:pPr>
-              <w:spacing w:line="259" w:lineRule="auto"/>
-              <w:ind w:left="5"/>
-            </w:pPr>
+            <w:tcW w:w="2772" w:type="dxa"/>
+            <w:tcBorders>
+              <w:top w:val="nil"/>
+              <w:left w:val="single" w:sz="4" w:space="0" w:color="000000"/>
+              <w:bottom w:val="single" w:sz="4" w:space="0" w:color="000000"/>
+              <w:right w:val="single" w:sz="4" w:space="0" w:color="000000"/>
+            </w:tcBorders>
+            <w:vAlign w:val="center"/>
+            <w:hideMark/>
+          </w:tcPr>
+          <w:p>
             <w:r>
               <w:t>int</w:t>
             </w:r>
@@ -6002,25 +5640,211 @@
         </w:tc>
         <w:tc>
           <w:tcPr>
-            <w:tcW w:w="2565" w:type="dxa"/>
-            <w:tcBorders>
-              <w:top w:val="single" w:sz="4" w:space="0" w:color="000000"/>
-              <w:left w:val="single" w:sz="4" w:space="0" w:color="000000"/>
-              <w:bottom w:val="single" w:sz="4" w:space="0" w:color="000000"/>
-              <w:right w:val="single" w:sz="4" w:space="0" w:color="000000"/>
-            </w:tcBorders>
-          </w:tcPr>
-          <w:p>
-            <w:pPr>
-              <w:spacing w:line="259" w:lineRule="auto"/>
-              <w:ind w:left="2"/>
-            </w:pPr>
+            <w:tcW w:w="3210" w:type="dxa"/>
+            <w:tcBorders>
+              <w:top w:val="nil"/>
+              <w:left w:val="single" w:sz="4" w:space="0" w:color="000000"/>
+              <w:bottom w:val="single" w:sz="4" w:space="0" w:color="000000"/>
+              <w:right w:val="single" w:sz="4" w:space="0" w:color="000000"/>
+            </w:tcBorders>
+            <w:hideMark/>
+          </w:tcPr>
+          <w:p>
             <w:r>
               <w:t>Primary Key</w:t>
             </w:r>
-            <w:r>
-              <w:rPr>
-                <w:rFonts w:ascii="Calibri" w:eastAsia="Calibri" w:hAnsi="Calibri" w:cs="Calibri"/>
+          </w:p>
+        </w:tc>
+      </w:tr>
+      <w:tr>
+        <w:trPr>
+          <w:trHeight w:val="346"/>
+        </w:trPr>
+        <w:tc>
+          <w:tcPr>
+            <w:tcW w:w="3236" w:type="dxa"/>
+            <w:tcBorders>
+              <w:top w:val="single" w:sz="4" w:space="0" w:color="000000"/>
+              <w:left w:val="single" w:sz="4" w:space="0" w:color="000000"/>
+              <w:bottom w:val="single" w:sz="4" w:space="0" w:color="000000"/>
+              <w:right w:val="single" w:sz="4" w:space="0" w:color="000000"/>
+            </w:tcBorders>
+            <w:vAlign w:val="center"/>
+            <w:hideMark/>
+          </w:tcPr>
+          <w:p>
+            <w:proofErr w:type="spellStart"/>
+            <w:r>
+              <w:t>UniversityId</w:t>
+            </w:r>
+            <w:proofErr w:type="spellEnd"/>
+            <w:r>
+              <w:t xml:space="preserve"> (FK)</w:t>
+            </w:r>
+          </w:p>
+        </w:tc>
+        <w:tc>
+          <w:tcPr>
+            <w:tcW w:w="2772" w:type="dxa"/>
+            <w:tcBorders>
+              <w:top w:val="single" w:sz="4" w:space="0" w:color="000000"/>
+              <w:left w:val="single" w:sz="4" w:space="0" w:color="000000"/>
+              <w:bottom w:val="single" w:sz="4" w:space="0" w:color="000000"/>
+              <w:right w:val="single" w:sz="4" w:space="0" w:color="000000"/>
+            </w:tcBorders>
+            <w:vAlign w:val="center"/>
+            <w:hideMark/>
+          </w:tcPr>
+          <w:p>
+            <w:r>
+              <w:t>int</w:t>
+            </w:r>
+          </w:p>
+        </w:tc>
+        <w:tc>
+          <w:tcPr>
+            <w:tcW w:w="3210" w:type="dxa"/>
+            <w:tcBorders>
+              <w:top w:val="single" w:sz="4" w:space="0" w:color="000000"/>
+              <w:left w:val="single" w:sz="4" w:space="0" w:color="000000"/>
+              <w:bottom w:val="single" w:sz="4" w:space="0" w:color="000000"/>
+              <w:right w:val="single" w:sz="4" w:space="0" w:color="000000"/>
+            </w:tcBorders>
+            <w:hideMark/>
+          </w:tcPr>
+          <w:p>
+            <w:r>
+              <w:t>Not Null</w:t>
+            </w:r>
+            <w:r>
+              <w:t>, FK → University</w:t>
+            </w:r>
+          </w:p>
+        </w:tc>
+      </w:tr>
+      <w:tr>
+        <w:trPr>
+          <w:trHeight w:val="346"/>
+        </w:trPr>
+        <w:tc>
+          <w:tcPr>
+            <w:tcW w:w="3236" w:type="dxa"/>
+            <w:tcBorders>
+              <w:top w:val="single" w:sz="4" w:space="0" w:color="000000"/>
+              <w:left w:val="single" w:sz="4" w:space="0" w:color="000000"/>
+              <w:bottom w:val="single" w:sz="4" w:space="0" w:color="000000"/>
+              <w:right w:val="single" w:sz="4" w:space="0" w:color="000000"/>
+            </w:tcBorders>
+            <w:vAlign w:val="center"/>
+          </w:tcPr>
+          <w:p>
+            <w:proofErr w:type="spellStart"/>
+            <w:r>
+              <w:t>CompanyId</w:t>
+            </w:r>
+            <w:proofErr w:type="spellEnd"/>
+            <w:r>
+              <w:t xml:space="preserve"> (FK)</w:t>
+            </w:r>
+          </w:p>
+        </w:tc>
+        <w:tc>
+          <w:tcPr>
+            <w:tcW w:w="2772" w:type="dxa"/>
+            <w:tcBorders>
+              <w:top w:val="single" w:sz="4" w:space="0" w:color="000000"/>
+              <w:left w:val="single" w:sz="4" w:space="0" w:color="000000"/>
+              <w:bottom w:val="single" w:sz="4" w:space="0" w:color="000000"/>
+              <w:right w:val="single" w:sz="4" w:space="0" w:color="000000"/>
+            </w:tcBorders>
+            <w:vAlign w:val="center"/>
+          </w:tcPr>
+          <w:p>
+            <w:r>
+              <w:t>int</w:t>
+            </w:r>
+          </w:p>
+        </w:tc>
+        <w:tc>
+          <w:tcPr>
+            <w:tcW w:w="3210" w:type="dxa"/>
+            <w:tcBorders>
+              <w:top w:val="single" w:sz="4" w:space="0" w:color="000000"/>
+              <w:left w:val="single" w:sz="4" w:space="0" w:color="000000"/>
+              <w:bottom w:val="single" w:sz="4" w:space="0" w:color="000000"/>
+              <w:right w:val="single" w:sz="4" w:space="0" w:color="000000"/>
+            </w:tcBorders>
+          </w:tcPr>
+          <w:p>
+            <w:r>
+              <w:t>Not Null</w:t>
+            </w:r>
+            <w:r>
+              <w:t>, FK → Companies</w:t>
+            </w:r>
+          </w:p>
+        </w:tc>
+      </w:tr>
+      <w:tr>
+        <w:trPr>
+          <w:trHeight w:val="346"/>
+        </w:trPr>
+        <w:tc>
+          <w:tcPr>
+            <w:tcW w:w="3236" w:type="dxa"/>
+            <w:tcBorders>
+              <w:top w:val="single" w:sz="4" w:space="0" w:color="000000"/>
+              <w:left w:val="single" w:sz="4" w:space="0" w:color="000000"/>
+              <w:bottom w:val="single" w:sz="4" w:space="0" w:color="000000"/>
+              <w:right w:val="single" w:sz="4" w:space="0" w:color="000000"/>
+            </w:tcBorders>
+            <w:vAlign w:val="center"/>
+            <w:hideMark/>
+          </w:tcPr>
+          <w:p>
+            <w:proofErr w:type="spellStart"/>
+            <w:r>
+              <w:t>JobRole</w:t>
+            </w:r>
+            <w:proofErr w:type="spellEnd"/>
+          </w:p>
+        </w:tc>
+        <w:tc>
+          <w:tcPr>
+            <w:tcW w:w="2772" w:type="dxa"/>
+            <w:tcBorders>
+              <w:top w:val="single" w:sz="4" w:space="0" w:color="000000"/>
+              <w:left w:val="single" w:sz="4" w:space="0" w:color="000000"/>
+              <w:bottom w:val="single" w:sz="4" w:space="0" w:color="000000"/>
+              <w:right w:val="single" w:sz="4" w:space="0" w:color="000000"/>
+            </w:tcBorders>
+            <w:vAlign w:val="center"/>
+            <w:hideMark/>
+          </w:tcPr>
+          <w:p>
+            <w:r>
+              <w:t>varchar</w:t>
+            </w:r>
+          </w:p>
+        </w:tc>
+        <w:tc>
+          <w:tcPr>
+            <w:tcW w:w="3210" w:type="dxa"/>
+            <w:tcBorders>
+              <w:top w:val="single" w:sz="4" w:space="0" w:color="000000"/>
+              <w:left w:val="single" w:sz="4" w:space="0" w:color="000000"/>
+              <w:bottom w:val="single" w:sz="4" w:space="0" w:color="000000"/>
+              <w:right w:val="single" w:sz="4" w:space="0" w:color="000000"/>
+            </w:tcBorders>
+            <w:hideMark/>
+          </w:tcPr>
+          <w:p>
+            <w:r>
+              <w:t>Not Null</w:t>
+            </w:r>
+            <w:r>
+              <w:rPr>
+                <w:b/>
               </w:rPr>
               <w:t xml:space="preserve"> </w:t>
             </w:r>
@@ -6033,67 +5857,56 @@
         </w:trPr>
         <w:tc>
           <w:tcPr>
-            <w:tcW w:w="4355" w:type="dxa"/>
-            <w:tcBorders>
-              <w:top w:val="single" w:sz="4" w:space="0" w:color="000000"/>
-              <w:left w:val="single" w:sz="4" w:space="0" w:color="000000"/>
-              <w:bottom w:val="single" w:sz="4" w:space="0" w:color="000000"/>
-              <w:right w:val="single" w:sz="4" w:space="0" w:color="000000"/>
-            </w:tcBorders>
-            <w:vAlign w:val="center"/>
-          </w:tcPr>
-          <w:p>
-            <w:pPr>
-              <w:spacing w:line="259" w:lineRule="auto"/>
-            </w:pPr>
+            <w:tcW w:w="3236" w:type="dxa"/>
+            <w:tcBorders>
+              <w:top w:val="single" w:sz="4" w:space="0" w:color="000000"/>
+              <w:left w:val="single" w:sz="4" w:space="0" w:color="000000"/>
+              <w:bottom w:val="single" w:sz="4" w:space="0" w:color="000000"/>
+              <w:right w:val="single" w:sz="4" w:space="0" w:color="000000"/>
+            </w:tcBorders>
+            <w:vAlign w:val="center"/>
+            <w:hideMark/>
+          </w:tcPr>
+          <w:p>
             <w:proofErr w:type="spellStart"/>
             <w:r>
-              <w:t>UserId</w:t>
+              <w:t>JobLocation</w:t>
             </w:r>
             <w:proofErr w:type="spellEnd"/>
-            <w:r>
-              <w:t xml:space="preserve"> (FK)</w:t>
-            </w:r>
-          </w:p>
-        </w:tc>
-        <w:tc>
-          <w:tcPr>
-            <w:tcW w:w="2294" w:type="dxa"/>
-            <w:tcBorders>
-              <w:top w:val="single" w:sz="4" w:space="0" w:color="000000"/>
-              <w:left w:val="single" w:sz="4" w:space="0" w:color="000000"/>
-              <w:bottom w:val="single" w:sz="4" w:space="0" w:color="000000"/>
-              <w:right w:val="single" w:sz="4" w:space="0" w:color="000000"/>
-            </w:tcBorders>
-            <w:vAlign w:val="center"/>
-          </w:tcPr>
-          <w:p>
-            <w:pPr>
-              <w:spacing w:line="259" w:lineRule="auto"/>
-              <w:ind w:left="5"/>
-            </w:pPr>
-            <w:r>
-              <w:t>int</w:t>
-            </w:r>
-          </w:p>
-        </w:tc>
-        <w:tc>
-          <w:tcPr>
-            <w:tcW w:w="2565" w:type="dxa"/>
-            <w:tcBorders>
-              <w:top w:val="single" w:sz="4" w:space="0" w:color="000000"/>
-              <w:left w:val="single" w:sz="4" w:space="0" w:color="000000"/>
-              <w:bottom w:val="single" w:sz="4" w:space="0" w:color="000000"/>
-              <w:right w:val="single" w:sz="4" w:space="0" w:color="000000"/>
-            </w:tcBorders>
-          </w:tcPr>
-          <w:p>
-            <w:pPr>
-              <w:spacing w:line="259" w:lineRule="auto"/>
-              <w:ind w:left="2"/>
-            </w:pPr>
-            <w:r>
-              <w:t>Not Null, FK → User</w:t>
+          </w:p>
+        </w:tc>
+        <w:tc>
+          <w:tcPr>
+            <w:tcW w:w="2772" w:type="dxa"/>
+            <w:tcBorders>
+              <w:top w:val="single" w:sz="4" w:space="0" w:color="000000"/>
+              <w:left w:val="single" w:sz="4" w:space="0" w:color="000000"/>
+              <w:bottom w:val="single" w:sz="4" w:space="0" w:color="000000"/>
+              <w:right w:val="single" w:sz="4" w:space="0" w:color="000000"/>
+            </w:tcBorders>
+            <w:vAlign w:val="center"/>
+            <w:hideMark/>
+          </w:tcPr>
+          <w:p>
+            <w:r>
+              <w:t>varchar</w:t>
+            </w:r>
+          </w:p>
+        </w:tc>
+        <w:tc>
+          <w:tcPr>
+            <w:tcW w:w="3210" w:type="dxa"/>
+            <w:tcBorders>
+              <w:top w:val="single" w:sz="4" w:space="0" w:color="000000"/>
+              <w:left w:val="single" w:sz="4" w:space="0" w:color="000000"/>
+              <w:bottom w:val="single" w:sz="4" w:space="0" w:color="000000"/>
+              <w:right w:val="single" w:sz="4" w:space="0" w:color="000000"/>
+            </w:tcBorders>
+            <w:hideMark/>
+          </w:tcPr>
+          <w:p>
+            <w:r>
+              <w:t>Not Null</w:t>
             </w:r>
           </w:p>
         </w:tc>
@@ -6104,73 +5917,51 @@
         </w:trPr>
         <w:tc>
           <w:tcPr>
-            <w:tcW w:w="4355" w:type="dxa"/>
-            <w:tcBorders>
-              <w:top w:val="single" w:sz="4" w:space="0" w:color="000000"/>
-              <w:left w:val="single" w:sz="4" w:space="0" w:color="000000"/>
-              <w:bottom w:val="single" w:sz="4" w:space="0" w:color="000000"/>
-              <w:right w:val="single" w:sz="4" w:space="0" w:color="000000"/>
-            </w:tcBorders>
-            <w:vAlign w:val="center"/>
-          </w:tcPr>
-          <w:p>
-            <w:pPr>
-              <w:spacing w:line="259" w:lineRule="auto"/>
-            </w:pPr>
-            <w:proofErr w:type="spellStart"/>
-            <w:r>
-              <w:t>CompanyId</w:t>
-            </w:r>
-            <w:proofErr w:type="spellEnd"/>
-            <w:r>
-              <w:t xml:space="preserve"> (FK)</w:t>
-            </w:r>
-          </w:p>
-        </w:tc>
-        <w:tc>
-          <w:tcPr>
-            <w:tcW w:w="2294" w:type="dxa"/>
-            <w:tcBorders>
-              <w:top w:val="single" w:sz="4" w:space="0" w:color="000000"/>
-              <w:left w:val="single" w:sz="4" w:space="0" w:color="000000"/>
-              <w:bottom w:val="single" w:sz="4" w:space="0" w:color="000000"/>
-              <w:right w:val="single" w:sz="4" w:space="0" w:color="000000"/>
-            </w:tcBorders>
-            <w:vAlign w:val="center"/>
-          </w:tcPr>
-          <w:p>
-            <w:pPr>
-              <w:spacing w:line="259" w:lineRule="auto"/>
-              <w:ind w:left="5"/>
-            </w:pPr>
-            <w:r>
-              <w:t>int</w:t>
-            </w:r>
-          </w:p>
-        </w:tc>
-        <w:tc>
-          <w:tcPr>
-            <w:tcW w:w="2565" w:type="dxa"/>
-            <w:tcBorders>
-              <w:top w:val="single" w:sz="4" w:space="0" w:color="000000"/>
-              <w:left w:val="single" w:sz="4" w:space="0" w:color="000000"/>
-              <w:bottom w:val="single" w:sz="4" w:space="0" w:color="000000"/>
-              <w:right w:val="single" w:sz="4" w:space="0" w:color="000000"/>
-            </w:tcBorders>
-          </w:tcPr>
-          <w:p>
-            <w:pPr>
-              <w:spacing w:line="259" w:lineRule="auto"/>
-              <w:ind w:left="2"/>
-            </w:pPr>
-            <w:r>
-              <w:t xml:space="preserve">Not Null, </w:t>
-            </w:r>
-            <w:r>
-              <w:t>FK →</w:t>
-            </w:r>
-            <w:r>
-              <w:t xml:space="preserve"> Companies</w:t>
+            <w:tcW w:w="3236" w:type="dxa"/>
+            <w:tcBorders>
+              <w:top w:val="single" w:sz="4" w:space="0" w:color="000000"/>
+              <w:left w:val="single" w:sz="4" w:space="0" w:color="000000"/>
+              <w:bottom w:val="single" w:sz="4" w:space="0" w:color="000000"/>
+              <w:right w:val="single" w:sz="4" w:space="0" w:color="000000"/>
+            </w:tcBorders>
+            <w:vAlign w:val="center"/>
+          </w:tcPr>
+          <w:p>
+            <w:r>
+              <w:t>Package</w:t>
+            </w:r>
+          </w:p>
+        </w:tc>
+        <w:tc>
+          <w:tcPr>
+            <w:tcW w:w="2772" w:type="dxa"/>
+            <w:tcBorders>
+              <w:top w:val="single" w:sz="4" w:space="0" w:color="000000"/>
+              <w:left w:val="single" w:sz="4" w:space="0" w:color="000000"/>
+              <w:bottom w:val="single" w:sz="4" w:space="0" w:color="000000"/>
+              <w:right w:val="single" w:sz="4" w:space="0" w:color="000000"/>
+            </w:tcBorders>
+            <w:vAlign w:val="center"/>
+          </w:tcPr>
+          <w:p>
+            <w:r>
+              <w:t>decimal</w:t>
+            </w:r>
+          </w:p>
+        </w:tc>
+        <w:tc>
+          <w:tcPr>
+            <w:tcW w:w="3210" w:type="dxa"/>
+            <w:tcBorders>
+              <w:top w:val="single" w:sz="4" w:space="0" w:color="000000"/>
+              <w:left w:val="single" w:sz="4" w:space="0" w:color="000000"/>
+              <w:bottom w:val="single" w:sz="4" w:space="0" w:color="000000"/>
+              <w:right w:val="single" w:sz="4" w:space="0" w:color="000000"/>
+            </w:tcBorders>
+          </w:tcPr>
+          <w:p>
+            <w:r>
+              <w:t>Not Null</w:t>
             </w:r>
           </w:p>
         </w:tc>
@@ -6181,40 +5972,202 @@
         </w:trPr>
         <w:tc>
           <w:tcPr>
-            <w:tcW w:w="4355" w:type="dxa"/>
-            <w:tcBorders>
-              <w:top w:val="single" w:sz="4" w:space="0" w:color="000000"/>
-              <w:left w:val="single" w:sz="4" w:space="0" w:color="000000"/>
-              <w:bottom w:val="single" w:sz="4" w:space="0" w:color="auto"/>
-              <w:right w:val="single" w:sz="4" w:space="0" w:color="000000"/>
-            </w:tcBorders>
-            <w:vAlign w:val="center"/>
-          </w:tcPr>
-          <w:p>
-            <w:pPr>
-              <w:spacing w:line="259" w:lineRule="auto"/>
-            </w:pPr>
-            <w:r>
-              <w:t>Designation</w:t>
-            </w:r>
-          </w:p>
-        </w:tc>
-        <w:tc>
-          <w:tcPr>
-            <w:tcW w:w="2294" w:type="dxa"/>
-            <w:tcBorders>
-              <w:top w:val="single" w:sz="4" w:space="0" w:color="000000"/>
-              <w:left w:val="single" w:sz="4" w:space="0" w:color="000000"/>
-              <w:bottom w:val="single" w:sz="4" w:space="0" w:color="auto"/>
-              <w:right w:val="single" w:sz="4" w:space="0" w:color="000000"/>
-            </w:tcBorders>
-            <w:vAlign w:val="center"/>
-          </w:tcPr>
-          <w:p>
-            <w:pPr>
-              <w:spacing w:line="259" w:lineRule="auto"/>
-              <w:ind w:left="5"/>
-            </w:pPr>
+            <w:tcW w:w="3236" w:type="dxa"/>
+            <w:tcBorders>
+              <w:top w:val="single" w:sz="4" w:space="0" w:color="000000"/>
+              <w:left w:val="single" w:sz="4" w:space="0" w:color="000000"/>
+              <w:bottom w:val="single" w:sz="4" w:space="0" w:color="000000"/>
+              <w:right w:val="single" w:sz="4" w:space="0" w:color="000000"/>
+            </w:tcBorders>
+            <w:vAlign w:val="center"/>
+          </w:tcPr>
+          <w:p>
+            <w:r>
+              <w:t>Description</w:t>
+            </w:r>
+          </w:p>
+        </w:tc>
+        <w:tc>
+          <w:tcPr>
+            <w:tcW w:w="2772" w:type="dxa"/>
+            <w:tcBorders>
+              <w:top w:val="single" w:sz="4" w:space="0" w:color="000000"/>
+              <w:left w:val="single" w:sz="4" w:space="0" w:color="000000"/>
+              <w:bottom w:val="single" w:sz="4" w:space="0" w:color="000000"/>
+              <w:right w:val="single" w:sz="4" w:space="0" w:color="000000"/>
+            </w:tcBorders>
+            <w:vAlign w:val="center"/>
+          </w:tcPr>
+          <w:p>
+            <w:r>
+              <w:t>text</w:t>
+            </w:r>
+          </w:p>
+        </w:tc>
+        <w:tc>
+          <w:tcPr>
+            <w:tcW w:w="3210" w:type="dxa"/>
+            <w:tcBorders>
+              <w:top w:val="single" w:sz="4" w:space="0" w:color="000000"/>
+              <w:left w:val="single" w:sz="4" w:space="0" w:color="000000"/>
+              <w:bottom w:val="single" w:sz="4" w:space="0" w:color="000000"/>
+              <w:right w:val="single" w:sz="4" w:space="0" w:color="000000"/>
+            </w:tcBorders>
+          </w:tcPr>
+          <w:p>
+            <w:r>
+              <w:t>Not Null</w:t>
+            </w:r>
+          </w:p>
+        </w:tc>
+      </w:tr>
+      <w:tr>
+        <w:trPr>
+          <w:trHeight w:val="348"/>
+        </w:trPr>
+        <w:tc>
+          <w:tcPr>
+            <w:tcW w:w="3236" w:type="dxa"/>
+            <w:tcBorders>
+              <w:top w:val="single" w:sz="4" w:space="0" w:color="000000"/>
+              <w:left w:val="single" w:sz="4" w:space="0" w:color="000000"/>
+              <w:bottom w:val="single" w:sz="4" w:space="0" w:color="000000"/>
+              <w:right w:val="single" w:sz="4" w:space="0" w:color="000000"/>
+            </w:tcBorders>
+            <w:vAlign w:val="center"/>
+          </w:tcPr>
+          <w:p>
+            <w:proofErr w:type="spellStart"/>
+            <w:r>
+              <w:t>RegistrationDeadline</w:t>
+            </w:r>
+            <w:proofErr w:type="spellEnd"/>
+          </w:p>
+        </w:tc>
+        <w:tc>
+          <w:tcPr>
+            <w:tcW w:w="2772" w:type="dxa"/>
+            <w:tcBorders>
+              <w:top w:val="single" w:sz="4" w:space="0" w:color="000000"/>
+              <w:left w:val="single" w:sz="4" w:space="0" w:color="000000"/>
+              <w:bottom w:val="single" w:sz="4" w:space="0" w:color="000000"/>
+              <w:right w:val="single" w:sz="4" w:space="0" w:color="000000"/>
+            </w:tcBorders>
+            <w:vAlign w:val="center"/>
+          </w:tcPr>
+          <w:p>
+            <w:r>
+              <w:t>datetime</w:t>
+            </w:r>
+          </w:p>
+        </w:tc>
+        <w:tc>
+          <w:tcPr>
+            <w:tcW w:w="3210" w:type="dxa"/>
+            <w:tcBorders>
+              <w:top w:val="single" w:sz="4" w:space="0" w:color="000000"/>
+              <w:left w:val="single" w:sz="4" w:space="0" w:color="000000"/>
+              <w:bottom w:val="single" w:sz="4" w:space="0" w:color="000000"/>
+              <w:right w:val="single" w:sz="4" w:space="0" w:color="000000"/>
+            </w:tcBorders>
+          </w:tcPr>
+          <w:p>
+            <w:r>
+              <w:t>Not Null</w:t>
+            </w:r>
+          </w:p>
+        </w:tc>
+      </w:tr>
+      <w:tr>
+        <w:trPr>
+          <w:trHeight w:val="348"/>
+        </w:trPr>
+        <w:tc>
+          <w:tcPr>
+            <w:tcW w:w="3236" w:type="dxa"/>
+            <w:tcBorders>
+              <w:top w:val="single" w:sz="4" w:space="0" w:color="000000"/>
+              <w:left w:val="single" w:sz="4" w:space="0" w:color="000000"/>
+              <w:bottom w:val="single" w:sz="4" w:space="0" w:color="000000"/>
+              <w:right w:val="single" w:sz="4" w:space="0" w:color="000000"/>
+            </w:tcBorders>
+            <w:vAlign w:val="center"/>
+          </w:tcPr>
+          <w:p>
+            <w:proofErr w:type="spellStart"/>
+            <w:r>
+              <w:t>DriveDate</w:t>
+            </w:r>
+            <w:proofErr w:type="spellEnd"/>
+          </w:p>
+        </w:tc>
+        <w:tc>
+          <w:tcPr>
+            <w:tcW w:w="2772" w:type="dxa"/>
+            <w:tcBorders>
+              <w:top w:val="single" w:sz="4" w:space="0" w:color="000000"/>
+              <w:left w:val="single" w:sz="4" w:space="0" w:color="000000"/>
+              <w:bottom w:val="single" w:sz="4" w:space="0" w:color="000000"/>
+              <w:right w:val="single" w:sz="4" w:space="0" w:color="000000"/>
+            </w:tcBorders>
+            <w:vAlign w:val="center"/>
+          </w:tcPr>
+          <w:p>
+            <w:r>
+              <w:t>datetime</w:t>
+            </w:r>
+          </w:p>
+        </w:tc>
+        <w:tc>
+          <w:tcPr>
+            <w:tcW w:w="3210" w:type="dxa"/>
+            <w:tcBorders>
+              <w:top w:val="single" w:sz="4" w:space="0" w:color="000000"/>
+              <w:left w:val="single" w:sz="4" w:space="0" w:color="000000"/>
+              <w:bottom w:val="single" w:sz="4" w:space="0" w:color="000000"/>
+              <w:right w:val="single" w:sz="4" w:space="0" w:color="000000"/>
+            </w:tcBorders>
+          </w:tcPr>
+          <w:p>
+            <w:r>
+              <w:t>Not Null</w:t>
+            </w:r>
+          </w:p>
+        </w:tc>
+      </w:tr>
+      <w:tr>
+        <w:trPr>
+          <w:trHeight w:val="348"/>
+        </w:trPr>
+        <w:tc>
+          <w:tcPr>
+            <w:tcW w:w="3236" w:type="dxa"/>
+            <w:tcBorders>
+              <w:top w:val="single" w:sz="4" w:space="0" w:color="000000"/>
+              <w:left w:val="single" w:sz="4" w:space="0" w:color="000000"/>
+              <w:bottom w:val="single" w:sz="4" w:space="0" w:color="000000"/>
+              <w:right w:val="single" w:sz="4" w:space="0" w:color="000000"/>
+            </w:tcBorders>
+            <w:vAlign w:val="center"/>
+          </w:tcPr>
+          <w:p>
+            <w:r>
+              <w:t>Status</w:t>
+            </w:r>
+          </w:p>
+        </w:tc>
+        <w:tc>
+          <w:tcPr>
+            <w:tcW w:w="2772" w:type="dxa"/>
+            <w:tcBorders>
+              <w:top w:val="single" w:sz="4" w:space="0" w:color="000000"/>
+              <w:left w:val="single" w:sz="4" w:space="0" w:color="000000"/>
+              <w:bottom w:val="single" w:sz="4" w:space="0" w:color="000000"/>
+              <w:right w:val="single" w:sz="4" w:space="0" w:color="000000"/>
+            </w:tcBorders>
+            <w:vAlign w:val="center"/>
+          </w:tcPr>
+          <w:p>
             <w:r>
               <w:t>varchar</w:t>
             </w:r>
@@ -6222,19 +6175,170 @@
         </w:tc>
         <w:tc>
           <w:tcPr>
-            <w:tcW w:w="2565" w:type="dxa"/>
-            <w:tcBorders>
-              <w:top w:val="single" w:sz="4" w:space="0" w:color="000000"/>
-              <w:left w:val="single" w:sz="4" w:space="0" w:color="000000"/>
-              <w:bottom w:val="single" w:sz="4" w:space="0" w:color="auto"/>
-              <w:right w:val="single" w:sz="4" w:space="0" w:color="000000"/>
-            </w:tcBorders>
-          </w:tcPr>
-          <w:p>
-            <w:pPr>
-              <w:spacing w:line="259" w:lineRule="auto"/>
-              <w:ind w:left="2"/>
-            </w:pPr>
+            <w:tcW w:w="3210" w:type="dxa"/>
+            <w:tcBorders>
+              <w:top w:val="single" w:sz="4" w:space="0" w:color="000000"/>
+              <w:left w:val="single" w:sz="4" w:space="0" w:color="000000"/>
+              <w:bottom w:val="single" w:sz="4" w:space="0" w:color="000000"/>
+              <w:right w:val="single" w:sz="4" w:space="0" w:color="000000"/>
+            </w:tcBorders>
+          </w:tcPr>
+          <w:p>
+            <w:r>
+              <w:t>Not Null</w:t>
+            </w:r>
+          </w:p>
+        </w:tc>
+      </w:tr>
+      <w:tr>
+        <w:trPr>
+          <w:trHeight w:val="346"/>
+        </w:trPr>
+        <w:tc>
+          <w:tcPr>
+            <w:tcW w:w="3236" w:type="dxa"/>
+            <w:tcBorders>
+              <w:top w:val="single" w:sz="4" w:space="0" w:color="000000"/>
+              <w:left w:val="single" w:sz="4" w:space="0" w:color="000000"/>
+              <w:bottom w:val="single" w:sz="4" w:space="0" w:color="000000"/>
+              <w:right w:val="single" w:sz="4" w:space="0" w:color="000000"/>
+            </w:tcBorders>
+            <w:hideMark/>
+          </w:tcPr>
+          <w:p>
+            <w:proofErr w:type="spellStart"/>
+            <w:r>
+              <w:t>IsActive</w:t>
+            </w:r>
+            <w:proofErr w:type="spellEnd"/>
+            <w:r>
+              <w:rPr>
+                <w:b/>
+              </w:rPr>
+              <w:t xml:space="preserve"> </w:t>
+            </w:r>
+          </w:p>
+        </w:tc>
+        <w:tc>
+          <w:tcPr>
+            <w:tcW w:w="2772" w:type="dxa"/>
+            <w:tcBorders>
+              <w:top w:val="single" w:sz="4" w:space="0" w:color="000000"/>
+              <w:left w:val="single" w:sz="4" w:space="0" w:color="000000"/>
+              <w:bottom w:val="single" w:sz="4" w:space="0" w:color="000000"/>
+              <w:right w:val="single" w:sz="4" w:space="0" w:color="000000"/>
+            </w:tcBorders>
+            <w:hideMark/>
+          </w:tcPr>
+          <w:p>
+            <w:r>
+              <w:t>bit</w:t>
+            </w:r>
+            <w:r>
+              <w:rPr>
+                <w:b/>
+              </w:rPr>
+              <w:t xml:space="preserve"> </w:t>
+            </w:r>
+          </w:p>
+        </w:tc>
+        <w:tc>
+          <w:tcPr>
+            <w:tcW w:w="3210" w:type="dxa"/>
+            <w:tcBorders>
+              <w:top w:val="single" w:sz="4" w:space="0" w:color="000000"/>
+              <w:left w:val="single" w:sz="4" w:space="0" w:color="000000"/>
+              <w:bottom w:val="single" w:sz="4" w:space="0" w:color="000000"/>
+              <w:right w:val="single" w:sz="4" w:space="0" w:color="000000"/>
+            </w:tcBorders>
+            <w:hideMark/>
+          </w:tcPr>
+          <w:p>
+            <w:r>
+              <w:t xml:space="preserve">Not Null </w:t>
+            </w:r>
+            <w:r>
+              <w:rPr>
+                <w:b/>
+              </w:rPr>
+              <w:t xml:space="preserve"> </w:t>
+            </w:r>
+          </w:p>
+        </w:tc>
+      </w:tr>
+      <w:tr>
+        <w:trPr>
+          <w:trHeight w:val="346"/>
+        </w:trPr>
+        <w:tc>
+          <w:tcPr>
+            <w:tcW w:w="3236" w:type="dxa"/>
+            <w:tcBorders>
+              <w:top w:val="single" w:sz="4" w:space="0" w:color="000000"/>
+              <w:left w:val="single" w:sz="4" w:space="0" w:color="000000"/>
+              <w:bottom w:val="single" w:sz="4" w:space="0" w:color="000000"/>
+              <w:right w:val="single" w:sz="4" w:space="0" w:color="000000"/>
+            </w:tcBorders>
+            <w:hideMark/>
+          </w:tcPr>
+          <w:p>
+            <w:proofErr w:type="spellStart"/>
+            <w:r>
+              <w:t>IsDeleted</w:t>
+            </w:r>
+            <w:proofErr w:type="spellEnd"/>
+            <w:r>
+              <w:rPr>
+                <w:b/>
+              </w:rPr>
+              <w:t xml:space="preserve"> </w:t>
+            </w:r>
+          </w:p>
+        </w:tc>
+        <w:tc>
+          <w:tcPr>
+            <w:tcW w:w="2772" w:type="dxa"/>
+            <w:tcBorders>
+              <w:top w:val="single" w:sz="4" w:space="0" w:color="000000"/>
+              <w:left w:val="single" w:sz="4" w:space="0" w:color="000000"/>
+              <w:bottom w:val="single" w:sz="4" w:space="0" w:color="000000"/>
+              <w:right w:val="single" w:sz="4" w:space="0" w:color="000000"/>
+            </w:tcBorders>
+            <w:hideMark/>
+          </w:tcPr>
+          <w:p>
+            <w:r>
+              <w:t>bit</w:t>
+            </w:r>
+            <w:r>
+              <w:rPr>
+                <w:b/>
+              </w:rPr>
+              <w:t xml:space="preserve"> </w:t>
+            </w:r>
+          </w:p>
+        </w:tc>
+        <w:tc>
+          <w:tcPr>
+            <w:tcW w:w="3210" w:type="dxa"/>
+            <w:tcBorders>
+              <w:top w:val="single" w:sz="4" w:space="0" w:color="000000"/>
+              <w:left w:val="single" w:sz="4" w:space="0" w:color="000000"/>
+              <w:bottom w:val="single" w:sz="4" w:space="0" w:color="000000"/>
+              <w:right w:val="single" w:sz="4" w:space="0" w:color="000000"/>
+            </w:tcBorders>
+            <w:hideMark/>
+          </w:tcPr>
+          <w:p>
+            <w:r>
+              <w:t>Allow Null, Soft Delete</w:t>
+            </w:r>
+            <w:r>
+              <w:rPr>
+                <w:b/>
+              </w:rPr>
+              <w:t xml:space="preserve"> </w:t>
+            </w:r>
           </w:p>
         </w:tc>
       </w:tr>
@@ -6289,7 +6393,7 @@
                 <w:color w:val="FFFFFF"/>
                 <w:sz w:val="32"/>
               </w:rPr>
-              <w:t>PlacementDrives</w:t>
+              <w:t>EligibilityCriteria</w:t>
             </w:r>
             <w:proofErr w:type="spellEnd"/>
           </w:p>
@@ -6419,7 +6523,7 @@
           <w:p>
             <w:proofErr w:type="spellStart"/>
             <w:r>
-              <w:t>DriveId</w:t>
+              <w:t>CriteriaId</w:t>
             </w:r>
             <w:proofErr w:type="spellEnd"/>
             <w:r>
@@ -6521,10 +6625,7 @@
           </w:tcPr>
           <w:p>
             <w:r>
-              <w:t>Not Null</w:t>
-            </w:r>
-            <w:r>
-              <w:t>, FK → University</w:t>
+              <w:t>Not Null, FK → University</w:t>
             </w:r>
           </w:p>
         </w:tc>
@@ -6547,7 +6648,7 @@
           <w:p>
             <w:proofErr w:type="spellStart"/>
             <w:r>
-              <w:t>CompanyId</w:t>
+              <w:t>DriveId</w:t>
             </w:r>
             <w:proofErr w:type="spellEnd"/>
             <w:r>
@@ -6584,11 +6685,13 @@
           </w:tcPr>
           <w:p>
             <w:r>
-              <w:t>Not Null</w:t>
-            </w:r>
-            <w:r>
-              <w:t>, FK → Companies</w:t>
-            </w:r>
+              <w:t xml:space="preserve">Not Null, FK → </w:t>
+            </w:r>
+            <w:proofErr w:type="spellStart"/>
+            <w:r>
+              <w:t>PlacementDrives</w:t>
+            </w:r>
+            <w:proofErr w:type="spellEnd"/>
           </w:p>
         </w:tc>
       </w:tr>
@@ -6611,917 +6714,7 @@
           <w:p>
             <w:proofErr w:type="spellStart"/>
             <w:r>
-              <w:t>JobRole</w:t>
-            </w:r>
-            <w:proofErr w:type="spellEnd"/>
-          </w:p>
-        </w:tc>
-        <w:tc>
-          <w:tcPr>
-            <w:tcW w:w="2772" w:type="dxa"/>
-            <w:tcBorders>
-              <w:top w:val="single" w:sz="4" w:space="0" w:color="000000"/>
-              <w:left w:val="single" w:sz="4" w:space="0" w:color="000000"/>
-              <w:bottom w:val="single" w:sz="4" w:space="0" w:color="000000"/>
-              <w:right w:val="single" w:sz="4" w:space="0" w:color="000000"/>
-            </w:tcBorders>
-            <w:vAlign w:val="center"/>
-            <w:hideMark/>
-          </w:tcPr>
-          <w:p>
-            <w:r>
-              <w:t>varchar</w:t>
-            </w:r>
-          </w:p>
-        </w:tc>
-        <w:tc>
-          <w:tcPr>
-            <w:tcW w:w="3210" w:type="dxa"/>
-            <w:tcBorders>
-              <w:top w:val="single" w:sz="4" w:space="0" w:color="000000"/>
-              <w:left w:val="single" w:sz="4" w:space="0" w:color="000000"/>
-              <w:bottom w:val="single" w:sz="4" w:space="0" w:color="000000"/>
-              <w:right w:val="single" w:sz="4" w:space="0" w:color="000000"/>
-            </w:tcBorders>
-            <w:hideMark/>
-          </w:tcPr>
-          <w:p>
-            <w:r>
-              <w:t>Not Null</w:t>
-            </w:r>
-            <w:r>
-              <w:rPr>
-                <w:b/>
-              </w:rPr>
-              <w:t xml:space="preserve"> </w:t>
-            </w:r>
-          </w:p>
-        </w:tc>
-      </w:tr>
-      <w:tr>
-        <w:trPr>
-          <w:trHeight w:val="348"/>
-        </w:trPr>
-        <w:tc>
-          <w:tcPr>
-            <w:tcW w:w="3236" w:type="dxa"/>
-            <w:tcBorders>
-              <w:top w:val="single" w:sz="4" w:space="0" w:color="000000"/>
-              <w:left w:val="single" w:sz="4" w:space="0" w:color="000000"/>
-              <w:bottom w:val="single" w:sz="4" w:space="0" w:color="000000"/>
-              <w:right w:val="single" w:sz="4" w:space="0" w:color="000000"/>
-            </w:tcBorders>
-            <w:vAlign w:val="center"/>
-            <w:hideMark/>
-          </w:tcPr>
-          <w:p>
-            <w:proofErr w:type="spellStart"/>
-            <w:r>
-              <w:t>JobLocation</w:t>
-            </w:r>
-            <w:proofErr w:type="spellEnd"/>
-          </w:p>
-        </w:tc>
-        <w:tc>
-          <w:tcPr>
-            <w:tcW w:w="2772" w:type="dxa"/>
-            <w:tcBorders>
-              <w:top w:val="single" w:sz="4" w:space="0" w:color="000000"/>
-              <w:left w:val="single" w:sz="4" w:space="0" w:color="000000"/>
-              <w:bottom w:val="single" w:sz="4" w:space="0" w:color="000000"/>
-              <w:right w:val="single" w:sz="4" w:space="0" w:color="000000"/>
-            </w:tcBorders>
-            <w:vAlign w:val="center"/>
-            <w:hideMark/>
-          </w:tcPr>
-          <w:p>
-            <w:r>
-              <w:t>varchar</w:t>
-            </w:r>
-          </w:p>
-        </w:tc>
-        <w:tc>
-          <w:tcPr>
-            <w:tcW w:w="3210" w:type="dxa"/>
-            <w:tcBorders>
-              <w:top w:val="single" w:sz="4" w:space="0" w:color="000000"/>
-              <w:left w:val="single" w:sz="4" w:space="0" w:color="000000"/>
-              <w:bottom w:val="single" w:sz="4" w:space="0" w:color="000000"/>
-              <w:right w:val="single" w:sz="4" w:space="0" w:color="000000"/>
-            </w:tcBorders>
-            <w:hideMark/>
-          </w:tcPr>
-          <w:p>
-            <w:r>
-              <w:t>Not Null</w:t>
-            </w:r>
-          </w:p>
-        </w:tc>
-      </w:tr>
-      <w:tr>
-        <w:trPr>
-          <w:trHeight w:val="348"/>
-        </w:trPr>
-        <w:tc>
-          <w:tcPr>
-            <w:tcW w:w="3236" w:type="dxa"/>
-            <w:tcBorders>
-              <w:top w:val="single" w:sz="4" w:space="0" w:color="000000"/>
-              <w:left w:val="single" w:sz="4" w:space="0" w:color="000000"/>
-              <w:bottom w:val="single" w:sz="4" w:space="0" w:color="000000"/>
-              <w:right w:val="single" w:sz="4" w:space="0" w:color="000000"/>
-            </w:tcBorders>
-            <w:vAlign w:val="center"/>
-          </w:tcPr>
-          <w:p>
-            <w:r>
-              <w:t>Package</w:t>
-            </w:r>
-          </w:p>
-        </w:tc>
-        <w:tc>
-          <w:tcPr>
-            <w:tcW w:w="2772" w:type="dxa"/>
-            <w:tcBorders>
-              <w:top w:val="single" w:sz="4" w:space="0" w:color="000000"/>
-              <w:left w:val="single" w:sz="4" w:space="0" w:color="000000"/>
-              <w:bottom w:val="single" w:sz="4" w:space="0" w:color="000000"/>
-              <w:right w:val="single" w:sz="4" w:space="0" w:color="000000"/>
-            </w:tcBorders>
-            <w:vAlign w:val="center"/>
-          </w:tcPr>
-          <w:p>
-            <w:r>
-              <w:t>decimal</w:t>
-            </w:r>
-          </w:p>
-        </w:tc>
-        <w:tc>
-          <w:tcPr>
-            <w:tcW w:w="3210" w:type="dxa"/>
-            <w:tcBorders>
-              <w:top w:val="single" w:sz="4" w:space="0" w:color="000000"/>
-              <w:left w:val="single" w:sz="4" w:space="0" w:color="000000"/>
-              <w:bottom w:val="single" w:sz="4" w:space="0" w:color="000000"/>
-              <w:right w:val="single" w:sz="4" w:space="0" w:color="000000"/>
-            </w:tcBorders>
-          </w:tcPr>
-          <w:p>
-            <w:r>
-              <w:t>Not Null</w:t>
-            </w:r>
-          </w:p>
-        </w:tc>
-      </w:tr>
-      <w:tr>
-        <w:trPr>
-          <w:trHeight w:val="348"/>
-        </w:trPr>
-        <w:tc>
-          <w:tcPr>
-            <w:tcW w:w="3236" w:type="dxa"/>
-            <w:tcBorders>
-              <w:top w:val="single" w:sz="4" w:space="0" w:color="000000"/>
-              <w:left w:val="single" w:sz="4" w:space="0" w:color="000000"/>
-              <w:bottom w:val="single" w:sz="4" w:space="0" w:color="000000"/>
-              <w:right w:val="single" w:sz="4" w:space="0" w:color="000000"/>
-            </w:tcBorders>
-            <w:vAlign w:val="center"/>
-          </w:tcPr>
-          <w:p>
-            <w:r>
-              <w:t>Description</w:t>
-            </w:r>
-          </w:p>
-        </w:tc>
-        <w:tc>
-          <w:tcPr>
-            <w:tcW w:w="2772" w:type="dxa"/>
-            <w:tcBorders>
-              <w:top w:val="single" w:sz="4" w:space="0" w:color="000000"/>
-              <w:left w:val="single" w:sz="4" w:space="0" w:color="000000"/>
-              <w:bottom w:val="single" w:sz="4" w:space="0" w:color="000000"/>
-              <w:right w:val="single" w:sz="4" w:space="0" w:color="000000"/>
-            </w:tcBorders>
-            <w:vAlign w:val="center"/>
-          </w:tcPr>
-          <w:p>
-            <w:r>
-              <w:t>text</w:t>
-            </w:r>
-          </w:p>
-        </w:tc>
-        <w:tc>
-          <w:tcPr>
-            <w:tcW w:w="3210" w:type="dxa"/>
-            <w:tcBorders>
-              <w:top w:val="single" w:sz="4" w:space="0" w:color="000000"/>
-              <w:left w:val="single" w:sz="4" w:space="0" w:color="000000"/>
-              <w:bottom w:val="single" w:sz="4" w:space="0" w:color="000000"/>
-              <w:right w:val="single" w:sz="4" w:space="0" w:color="000000"/>
-            </w:tcBorders>
-          </w:tcPr>
-          <w:p>
-            <w:r>
-              <w:t>Not Null</w:t>
-            </w:r>
-          </w:p>
-        </w:tc>
-      </w:tr>
-      <w:tr>
-        <w:trPr>
-          <w:trHeight w:val="348"/>
-        </w:trPr>
-        <w:tc>
-          <w:tcPr>
-            <w:tcW w:w="3236" w:type="dxa"/>
-            <w:tcBorders>
-              <w:top w:val="single" w:sz="4" w:space="0" w:color="000000"/>
-              <w:left w:val="single" w:sz="4" w:space="0" w:color="000000"/>
-              <w:bottom w:val="single" w:sz="4" w:space="0" w:color="000000"/>
-              <w:right w:val="single" w:sz="4" w:space="0" w:color="000000"/>
-            </w:tcBorders>
-            <w:vAlign w:val="center"/>
-          </w:tcPr>
-          <w:p>
-            <w:proofErr w:type="spellStart"/>
-            <w:r>
-              <w:t>RegistrationDeadline</w:t>
-            </w:r>
-            <w:proofErr w:type="spellEnd"/>
-          </w:p>
-        </w:tc>
-        <w:tc>
-          <w:tcPr>
-            <w:tcW w:w="2772" w:type="dxa"/>
-            <w:tcBorders>
-              <w:top w:val="single" w:sz="4" w:space="0" w:color="000000"/>
-              <w:left w:val="single" w:sz="4" w:space="0" w:color="000000"/>
-              <w:bottom w:val="single" w:sz="4" w:space="0" w:color="000000"/>
-              <w:right w:val="single" w:sz="4" w:space="0" w:color="000000"/>
-            </w:tcBorders>
-            <w:vAlign w:val="center"/>
-          </w:tcPr>
-          <w:p>
-            <w:r>
-              <w:t>datetime</w:t>
-            </w:r>
-          </w:p>
-        </w:tc>
-        <w:tc>
-          <w:tcPr>
-            <w:tcW w:w="3210" w:type="dxa"/>
-            <w:tcBorders>
-              <w:top w:val="single" w:sz="4" w:space="0" w:color="000000"/>
-              <w:left w:val="single" w:sz="4" w:space="0" w:color="000000"/>
-              <w:bottom w:val="single" w:sz="4" w:space="0" w:color="000000"/>
-              <w:right w:val="single" w:sz="4" w:space="0" w:color="000000"/>
-            </w:tcBorders>
-          </w:tcPr>
-          <w:p>
-            <w:r>
-              <w:t>Not Null</w:t>
-            </w:r>
-          </w:p>
-        </w:tc>
-      </w:tr>
-      <w:tr>
-        <w:trPr>
-          <w:trHeight w:val="348"/>
-        </w:trPr>
-        <w:tc>
-          <w:tcPr>
-            <w:tcW w:w="3236" w:type="dxa"/>
-            <w:tcBorders>
-              <w:top w:val="single" w:sz="4" w:space="0" w:color="000000"/>
-              <w:left w:val="single" w:sz="4" w:space="0" w:color="000000"/>
-              <w:bottom w:val="single" w:sz="4" w:space="0" w:color="000000"/>
-              <w:right w:val="single" w:sz="4" w:space="0" w:color="000000"/>
-            </w:tcBorders>
-            <w:vAlign w:val="center"/>
-          </w:tcPr>
-          <w:p>
-            <w:proofErr w:type="spellStart"/>
-            <w:r>
-              <w:t>DriveDate</w:t>
-            </w:r>
-            <w:proofErr w:type="spellEnd"/>
-          </w:p>
-        </w:tc>
-        <w:tc>
-          <w:tcPr>
-            <w:tcW w:w="2772" w:type="dxa"/>
-            <w:tcBorders>
-              <w:top w:val="single" w:sz="4" w:space="0" w:color="000000"/>
-              <w:left w:val="single" w:sz="4" w:space="0" w:color="000000"/>
-              <w:bottom w:val="single" w:sz="4" w:space="0" w:color="000000"/>
-              <w:right w:val="single" w:sz="4" w:space="0" w:color="000000"/>
-            </w:tcBorders>
-            <w:vAlign w:val="center"/>
-          </w:tcPr>
-          <w:p>
-            <w:r>
-              <w:t>datetime</w:t>
-            </w:r>
-          </w:p>
-        </w:tc>
-        <w:tc>
-          <w:tcPr>
-            <w:tcW w:w="3210" w:type="dxa"/>
-            <w:tcBorders>
-              <w:top w:val="single" w:sz="4" w:space="0" w:color="000000"/>
-              <w:left w:val="single" w:sz="4" w:space="0" w:color="000000"/>
-              <w:bottom w:val="single" w:sz="4" w:space="0" w:color="000000"/>
-              <w:right w:val="single" w:sz="4" w:space="0" w:color="000000"/>
-            </w:tcBorders>
-          </w:tcPr>
-          <w:p>
-            <w:r>
-              <w:t>Not Null</w:t>
-            </w:r>
-          </w:p>
-        </w:tc>
-      </w:tr>
-      <w:tr>
-        <w:trPr>
-          <w:trHeight w:val="348"/>
-        </w:trPr>
-        <w:tc>
-          <w:tcPr>
-            <w:tcW w:w="3236" w:type="dxa"/>
-            <w:tcBorders>
-              <w:top w:val="single" w:sz="4" w:space="0" w:color="000000"/>
-              <w:left w:val="single" w:sz="4" w:space="0" w:color="000000"/>
-              <w:bottom w:val="single" w:sz="4" w:space="0" w:color="000000"/>
-              <w:right w:val="single" w:sz="4" w:space="0" w:color="000000"/>
-            </w:tcBorders>
-            <w:vAlign w:val="center"/>
-          </w:tcPr>
-          <w:p>
-            <w:r>
-              <w:t>Status</w:t>
-            </w:r>
-          </w:p>
-        </w:tc>
-        <w:tc>
-          <w:tcPr>
-            <w:tcW w:w="2772" w:type="dxa"/>
-            <w:tcBorders>
-              <w:top w:val="single" w:sz="4" w:space="0" w:color="000000"/>
-              <w:left w:val="single" w:sz="4" w:space="0" w:color="000000"/>
-              <w:bottom w:val="single" w:sz="4" w:space="0" w:color="000000"/>
-              <w:right w:val="single" w:sz="4" w:space="0" w:color="000000"/>
-            </w:tcBorders>
-            <w:vAlign w:val="center"/>
-          </w:tcPr>
-          <w:p>
-            <w:r>
-              <w:t>varchar</w:t>
-            </w:r>
-          </w:p>
-        </w:tc>
-        <w:tc>
-          <w:tcPr>
-            <w:tcW w:w="3210" w:type="dxa"/>
-            <w:tcBorders>
-              <w:top w:val="single" w:sz="4" w:space="0" w:color="000000"/>
-              <w:left w:val="single" w:sz="4" w:space="0" w:color="000000"/>
-              <w:bottom w:val="single" w:sz="4" w:space="0" w:color="000000"/>
-              <w:right w:val="single" w:sz="4" w:space="0" w:color="000000"/>
-            </w:tcBorders>
-          </w:tcPr>
-          <w:p>
-            <w:r>
-              <w:t>Not Null</w:t>
-            </w:r>
-          </w:p>
-        </w:tc>
-      </w:tr>
-      <w:tr>
-        <w:trPr>
-          <w:trHeight w:val="346"/>
-        </w:trPr>
-        <w:tc>
-          <w:tcPr>
-            <w:tcW w:w="3236" w:type="dxa"/>
-            <w:tcBorders>
-              <w:top w:val="single" w:sz="4" w:space="0" w:color="000000"/>
-              <w:left w:val="single" w:sz="4" w:space="0" w:color="000000"/>
-              <w:bottom w:val="single" w:sz="4" w:space="0" w:color="000000"/>
-              <w:right w:val="single" w:sz="4" w:space="0" w:color="000000"/>
-            </w:tcBorders>
-            <w:hideMark/>
-          </w:tcPr>
-          <w:p>
-            <w:proofErr w:type="spellStart"/>
-            <w:r>
-              <w:t>IsActive</w:t>
-            </w:r>
-            <w:proofErr w:type="spellEnd"/>
-            <w:r>
-              <w:rPr>
-                <w:b/>
-              </w:rPr>
-              <w:t xml:space="preserve"> </w:t>
-            </w:r>
-          </w:p>
-        </w:tc>
-        <w:tc>
-          <w:tcPr>
-            <w:tcW w:w="2772" w:type="dxa"/>
-            <w:tcBorders>
-              <w:top w:val="single" w:sz="4" w:space="0" w:color="000000"/>
-              <w:left w:val="single" w:sz="4" w:space="0" w:color="000000"/>
-              <w:bottom w:val="single" w:sz="4" w:space="0" w:color="000000"/>
-              <w:right w:val="single" w:sz="4" w:space="0" w:color="000000"/>
-            </w:tcBorders>
-            <w:hideMark/>
-          </w:tcPr>
-          <w:p>
-            <w:r>
-              <w:t>bit</w:t>
-            </w:r>
-            <w:r>
-              <w:rPr>
-                <w:b/>
-              </w:rPr>
-              <w:t xml:space="preserve"> </w:t>
-            </w:r>
-          </w:p>
-        </w:tc>
-        <w:tc>
-          <w:tcPr>
-            <w:tcW w:w="3210" w:type="dxa"/>
-            <w:tcBorders>
-              <w:top w:val="single" w:sz="4" w:space="0" w:color="000000"/>
-              <w:left w:val="single" w:sz="4" w:space="0" w:color="000000"/>
-              <w:bottom w:val="single" w:sz="4" w:space="0" w:color="000000"/>
-              <w:right w:val="single" w:sz="4" w:space="0" w:color="000000"/>
-            </w:tcBorders>
-            <w:hideMark/>
-          </w:tcPr>
-          <w:p>
-            <w:r>
-              <w:t xml:space="preserve">Not Null </w:t>
-            </w:r>
-            <w:r>
-              <w:rPr>
-                <w:b/>
-              </w:rPr>
-              <w:t xml:space="preserve"> </w:t>
-            </w:r>
-          </w:p>
-        </w:tc>
-      </w:tr>
-      <w:tr>
-        <w:trPr>
-          <w:trHeight w:val="346"/>
-        </w:trPr>
-        <w:tc>
-          <w:tcPr>
-            <w:tcW w:w="3236" w:type="dxa"/>
-            <w:tcBorders>
-              <w:top w:val="single" w:sz="4" w:space="0" w:color="000000"/>
-              <w:left w:val="single" w:sz="4" w:space="0" w:color="000000"/>
-              <w:bottom w:val="single" w:sz="4" w:space="0" w:color="000000"/>
-              <w:right w:val="single" w:sz="4" w:space="0" w:color="000000"/>
-            </w:tcBorders>
-            <w:hideMark/>
-          </w:tcPr>
-          <w:p>
-            <w:proofErr w:type="spellStart"/>
-            <w:r>
-              <w:t>IsDeleted</w:t>
-            </w:r>
-            <w:proofErr w:type="spellEnd"/>
-            <w:r>
-              <w:rPr>
-                <w:b/>
-              </w:rPr>
-              <w:t xml:space="preserve"> </w:t>
-            </w:r>
-          </w:p>
-        </w:tc>
-        <w:tc>
-          <w:tcPr>
-            <w:tcW w:w="2772" w:type="dxa"/>
-            <w:tcBorders>
-              <w:top w:val="single" w:sz="4" w:space="0" w:color="000000"/>
-              <w:left w:val="single" w:sz="4" w:space="0" w:color="000000"/>
-              <w:bottom w:val="single" w:sz="4" w:space="0" w:color="000000"/>
-              <w:right w:val="single" w:sz="4" w:space="0" w:color="000000"/>
-            </w:tcBorders>
-            <w:hideMark/>
-          </w:tcPr>
-          <w:p>
-            <w:r>
-              <w:t>bit</w:t>
-            </w:r>
-            <w:r>
-              <w:rPr>
-                <w:b/>
-              </w:rPr>
-              <w:t xml:space="preserve"> </w:t>
-            </w:r>
-          </w:p>
-        </w:tc>
-        <w:tc>
-          <w:tcPr>
-            <w:tcW w:w="3210" w:type="dxa"/>
-            <w:tcBorders>
-              <w:top w:val="single" w:sz="4" w:space="0" w:color="000000"/>
-              <w:left w:val="single" w:sz="4" w:space="0" w:color="000000"/>
-              <w:bottom w:val="single" w:sz="4" w:space="0" w:color="000000"/>
-              <w:right w:val="single" w:sz="4" w:space="0" w:color="000000"/>
-            </w:tcBorders>
-            <w:hideMark/>
-          </w:tcPr>
-          <w:p>
-            <w:r>
-              <w:t>Allow Null, Soft Delete</w:t>
-            </w:r>
-            <w:r>
-              <w:rPr>
-                <w:b/>
-              </w:rPr>
-              <w:t xml:space="preserve"> </w:t>
-            </w:r>
-          </w:p>
-        </w:tc>
-      </w:tr>
-    </w:tbl>
-    <w:p/>
-    <w:tbl>
-      <w:tblPr>
-        <w:tblW w:w="9218" w:type="dxa"/>
-        <w:tblInd w:w="312" w:type="dxa"/>
-        <w:tblCellMar>
-          <w:top w:w="73" w:type="dxa"/>
-          <w:right w:w="115" w:type="dxa"/>
-        </w:tblCellMar>
-        <w:tblLook w:val="04A0" w:firstRow="1" w:lastRow="0" w:firstColumn="1" w:lastColumn="0" w:noHBand="0" w:noVBand="1"/>
-      </w:tblPr>
-      <w:tblGrid>
-        <w:gridCol w:w="3236"/>
-        <w:gridCol w:w="2772"/>
-        <w:gridCol w:w="3210"/>
-      </w:tblGrid>
-      <w:tr>
-        <w:trPr>
-          <w:trHeight w:val="452"/>
-        </w:trPr>
-        <w:tc>
-          <w:tcPr>
-            <w:tcW w:w="3236" w:type="dxa"/>
-            <w:tcBorders>
-              <w:top w:val="single" w:sz="18" w:space="0" w:color="000000"/>
-              <w:left w:val="nil"/>
-              <w:bottom w:val="nil"/>
-              <w:right w:val="nil"/>
-            </w:tcBorders>
-            <w:shd w:val="clear" w:color="auto" w:fill="000000"/>
-            <w:hideMark/>
-          </w:tcPr>
-          <w:p>
-            <w:proofErr w:type="spellStart"/>
-            <w:r>
-              <w:rPr>
-                <w:rFonts w:ascii="Calibri" w:eastAsia="Calibri" w:hAnsi="Calibri" w:cs="Calibri"/>
-                <w:b/>
-                <w:color w:val="FFFFFF"/>
-                <w:sz w:val="32"/>
-              </w:rPr>
               <w:lastRenderedPageBreak/>
-              <w:t>CPM_</w:t>
-            </w:r>
-            <w:r>
-              <w:rPr>
-                <w:rFonts w:ascii="Calibri" w:eastAsia="Calibri" w:hAnsi="Calibri" w:cs="Calibri"/>
-                <w:b/>
-                <w:color w:val="FFFFFF"/>
-                <w:sz w:val="32"/>
-              </w:rPr>
-              <w:t>EligibilityCriteria</w:t>
-            </w:r>
-            <w:proofErr w:type="spellEnd"/>
-          </w:p>
-        </w:tc>
-        <w:tc>
-          <w:tcPr>
-            <w:tcW w:w="2772" w:type="dxa"/>
-            <w:tcBorders>
-              <w:top w:val="single" w:sz="18" w:space="0" w:color="000000"/>
-              <w:left w:val="nil"/>
-              <w:bottom w:val="nil"/>
-              <w:right w:val="nil"/>
-            </w:tcBorders>
-            <w:shd w:val="clear" w:color="auto" w:fill="000000"/>
-            <w:hideMark/>
-          </w:tcPr>
-          <w:p>
-            <w:r>
-              <w:t xml:space="preserve"> </w:t>
-            </w:r>
-          </w:p>
-        </w:tc>
-        <w:tc>
-          <w:tcPr>
-            <w:tcW w:w="3210" w:type="dxa"/>
-            <w:tcBorders>
-              <w:top w:val="single" w:sz="18" w:space="0" w:color="000000"/>
-              <w:left w:val="nil"/>
-              <w:bottom w:val="nil"/>
-              <w:right w:val="nil"/>
-            </w:tcBorders>
-            <w:shd w:val="clear" w:color="auto" w:fill="000000"/>
-            <w:hideMark/>
-          </w:tcPr>
-          <w:p>
-            <w:r>
-              <w:t xml:space="preserve"> </w:t>
-            </w:r>
-          </w:p>
-        </w:tc>
-      </w:tr>
-      <w:tr>
-        <w:trPr>
-          <w:trHeight w:val="370"/>
-        </w:trPr>
-        <w:tc>
-          <w:tcPr>
-            <w:tcW w:w="3236" w:type="dxa"/>
-            <w:tcBorders>
-              <w:top w:val="nil"/>
-              <w:left w:val="single" w:sz="4" w:space="0" w:color="000000"/>
-              <w:bottom w:val="single" w:sz="4" w:space="0" w:color="000000"/>
-              <w:right w:val="single" w:sz="4" w:space="0" w:color="000000"/>
-            </w:tcBorders>
-            <w:vAlign w:val="center"/>
-            <w:hideMark/>
-          </w:tcPr>
-          <w:p>
-            <w:r>
-              <w:rPr>
-                <w:b/>
-                <w:bCs/>
-              </w:rPr>
-              <w:t>Column</w:t>
-            </w:r>
-          </w:p>
-        </w:tc>
-        <w:tc>
-          <w:tcPr>
-            <w:tcW w:w="2772" w:type="dxa"/>
-            <w:tcBorders>
-              <w:top w:val="nil"/>
-              <w:left w:val="single" w:sz="4" w:space="0" w:color="000000"/>
-              <w:bottom w:val="single" w:sz="4" w:space="0" w:color="000000"/>
-              <w:right w:val="single" w:sz="4" w:space="0" w:color="000000"/>
-            </w:tcBorders>
-            <w:vAlign w:val="center"/>
-            <w:hideMark/>
-          </w:tcPr>
-          <w:p>
-            <w:r>
-              <w:rPr>
-                <w:b/>
-                <w:bCs/>
-              </w:rPr>
-              <w:t>Type</w:t>
-            </w:r>
-          </w:p>
-        </w:tc>
-        <w:tc>
-          <w:tcPr>
-            <w:tcW w:w="3210" w:type="dxa"/>
-            <w:tcBorders>
-              <w:top w:val="nil"/>
-              <w:left w:val="single" w:sz="4" w:space="0" w:color="000000"/>
-              <w:bottom w:val="single" w:sz="4" w:space="0" w:color="000000"/>
-              <w:right w:val="single" w:sz="4" w:space="0" w:color="000000"/>
-            </w:tcBorders>
-            <w:hideMark/>
-          </w:tcPr>
-          <w:p>
-            <w:r>
-              <w:rPr>
-                <w:b/>
-              </w:rPr>
-              <w:t xml:space="preserve">Remarks  </w:t>
-            </w:r>
-          </w:p>
-        </w:tc>
-      </w:tr>
-      <w:tr>
-        <w:trPr>
-          <w:trHeight w:val="351"/>
-        </w:trPr>
-        <w:tc>
-          <w:tcPr>
-            <w:tcW w:w="3236" w:type="dxa"/>
-            <w:tcBorders>
-              <w:top w:val="nil"/>
-              <w:left w:val="single" w:sz="4" w:space="0" w:color="000000"/>
-              <w:bottom w:val="single" w:sz="4" w:space="0" w:color="000000"/>
-              <w:right w:val="single" w:sz="4" w:space="0" w:color="000000"/>
-            </w:tcBorders>
-            <w:vAlign w:val="center"/>
-            <w:hideMark/>
-          </w:tcPr>
-          <w:p>
-            <w:proofErr w:type="spellStart"/>
-            <w:r>
-              <w:t>CriteriaId</w:t>
-            </w:r>
-            <w:proofErr w:type="spellEnd"/>
-            <w:r>
-              <w:t xml:space="preserve"> (PK)</w:t>
-            </w:r>
-          </w:p>
-        </w:tc>
-        <w:tc>
-          <w:tcPr>
-            <w:tcW w:w="2772" w:type="dxa"/>
-            <w:tcBorders>
-              <w:top w:val="nil"/>
-              <w:left w:val="single" w:sz="4" w:space="0" w:color="000000"/>
-              <w:bottom w:val="single" w:sz="4" w:space="0" w:color="000000"/>
-              <w:right w:val="single" w:sz="4" w:space="0" w:color="000000"/>
-            </w:tcBorders>
-            <w:vAlign w:val="center"/>
-            <w:hideMark/>
-          </w:tcPr>
-          <w:p>
-            <w:r>
-              <w:t>int</w:t>
-            </w:r>
-          </w:p>
-        </w:tc>
-        <w:tc>
-          <w:tcPr>
-            <w:tcW w:w="3210" w:type="dxa"/>
-            <w:tcBorders>
-              <w:top w:val="nil"/>
-              <w:left w:val="single" w:sz="4" w:space="0" w:color="000000"/>
-              <w:bottom w:val="single" w:sz="4" w:space="0" w:color="000000"/>
-              <w:right w:val="single" w:sz="4" w:space="0" w:color="000000"/>
-            </w:tcBorders>
-            <w:hideMark/>
-          </w:tcPr>
-          <w:p>
-            <w:r>
-              <w:t>Primary Key</w:t>
-            </w:r>
-          </w:p>
-        </w:tc>
-      </w:tr>
-      <w:tr>
-        <w:trPr>
-          <w:trHeight w:val="346"/>
-        </w:trPr>
-        <w:tc>
-          <w:tcPr>
-            <w:tcW w:w="3236" w:type="dxa"/>
-            <w:tcBorders>
-              <w:top w:val="single" w:sz="4" w:space="0" w:color="000000"/>
-              <w:left w:val="single" w:sz="4" w:space="0" w:color="000000"/>
-              <w:bottom w:val="single" w:sz="4" w:space="0" w:color="000000"/>
-              <w:right w:val="single" w:sz="4" w:space="0" w:color="000000"/>
-            </w:tcBorders>
-            <w:vAlign w:val="center"/>
-            <w:hideMark/>
-          </w:tcPr>
-          <w:p>
-            <w:proofErr w:type="spellStart"/>
-            <w:r>
-              <w:t>UniversityId</w:t>
-            </w:r>
-            <w:proofErr w:type="spellEnd"/>
-            <w:r>
-              <w:t xml:space="preserve"> (FK)</w:t>
-            </w:r>
-          </w:p>
-        </w:tc>
-        <w:tc>
-          <w:tcPr>
-            <w:tcW w:w="2772" w:type="dxa"/>
-            <w:tcBorders>
-              <w:top w:val="single" w:sz="4" w:space="0" w:color="000000"/>
-              <w:left w:val="single" w:sz="4" w:space="0" w:color="000000"/>
-              <w:bottom w:val="single" w:sz="4" w:space="0" w:color="000000"/>
-              <w:right w:val="single" w:sz="4" w:space="0" w:color="000000"/>
-            </w:tcBorders>
-            <w:vAlign w:val="center"/>
-            <w:hideMark/>
-          </w:tcPr>
-          <w:p>
-            <w:r>
-              <w:t>int</w:t>
-            </w:r>
-          </w:p>
-        </w:tc>
-        <w:tc>
-          <w:tcPr>
-            <w:tcW w:w="3210" w:type="dxa"/>
-            <w:tcBorders>
-              <w:top w:val="single" w:sz="4" w:space="0" w:color="000000"/>
-              <w:left w:val="single" w:sz="4" w:space="0" w:color="000000"/>
-              <w:bottom w:val="single" w:sz="4" w:space="0" w:color="000000"/>
-              <w:right w:val="single" w:sz="4" w:space="0" w:color="000000"/>
-            </w:tcBorders>
-            <w:hideMark/>
-          </w:tcPr>
-          <w:p>
-            <w:r>
-              <w:t>Not Null, FK → University</w:t>
-            </w:r>
-          </w:p>
-        </w:tc>
-      </w:tr>
-      <w:tr>
-        <w:trPr>
-          <w:trHeight w:val="346"/>
-        </w:trPr>
-        <w:tc>
-          <w:tcPr>
-            <w:tcW w:w="3236" w:type="dxa"/>
-            <w:tcBorders>
-              <w:top w:val="single" w:sz="4" w:space="0" w:color="000000"/>
-              <w:left w:val="single" w:sz="4" w:space="0" w:color="000000"/>
-              <w:bottom w:val="single" w:sz="4" w:space="0" w:color="000000"/>
-              <w:right w:val="single" w:sz="4" w:space="0" w:color="000000"/>
-            </w:tcBorders>
-            <w:vAlign w:val="center"/>
-          </w:tcPr>
-          <w:p>
-            <w:proofErr w:type="spellStart"/>
-            <w:r>
-              <w:t>DriveId</w:t>
-            </w:r>
-            <w:proofErr w:type="spellEnd"/>
-            <w:r>
-              <w:t xml:space="preserve"> (FK)</w:t>
-            </w:r>
-          </w:p>
-        </w:tc>
-        <w:tc>
-          <w:tcPr>
-            <w:tcW w:w="2772" w:type="dxa"/>
-            <w:tcBorders>
-              <w:top w:val="single" w:sz="4" w:space="0" w:color="000000"/>
-              <w:left w:val="single" w:sz="4" w:space="0" w:color="000000"/>
-              <w:bottom w:val="single" w:sz="4" w:space="0" w:color="000000"/>
-              <w:right w:val="single" w:sz="4" w:space="0" w:color="000000"/>
-            </w:tcBorders>
-            <w:vAlign w:val="center"/>
-          </w:tcPr>
-          <w:p>
-            <w:r>
-              <w:t>int</w:t>
-            </w:r>
-          </w:p>
-        </w:tc>
-        <w:tc>
-          <w:tcPr>
-            <w:tcW w:w="3210" w:type="dxa"/>
-            <w:tcBorders>
-              <w:top w:val="single" w:sz="4" w:space="0" w:color="000000"/>
-              <w:left w:val="single" w:sz="4" w:space="0" w:color="000000"/>
-              <w:bottom w:val="single" w:sz="4" w:space="0" w:color="000000"/>
-              <w:right w:val="single" w:sz="4" w:space="0" w:color="000000"/>
-            </w:tcBorders>
-          </w:tcPr>
-          <w:p>
-            <w:r>
-              <w:t xml:space="preserve">Not Null, FK → </w:t>
-            </w:r>
-            <w:proofErr w:type="spellStart"/>
-            <w:r>
-              <w:t>PlacementDrives</w:t>
-            </w:r>
-            <w:proofErr w:type="spellEnd"/>
-          </w:p>
-        </w:tc>
-      </w:tr>
-      <w:tr>
-        <w:trPr>
-          <w:trHeight w:val="346"/>
-        </w:trPr>
-        <w:tc>
-          <w:tcPr>
-            <w:tcW w:w="3236" w:type="dxa"/>
-            <w:tcBorders>
-              <w:top w:val="single" w:sz="4" w:space="0" w:color="000000"/>
-              <w:left w:val="single" w:sz="4" w:space="0" w:color="000000"/>
-              <w:bottom w:val="single" w:sz="4" w:space="0" w:color="000000"/>
-              <w:right w:val="single" w:sz="4" w:space="0" w:color="000000"/>
-            </w:tcBorders>
-            <w:vAlign w:val="center"/>
-            <w:hideMark/>
-          </w:tcPr>
-          <w:p>
-            <w:proofErr w:type="spellStart"/>
-            <w:r>
               <w:t>MinimumCGPA</w:t>
             </w:r>
             <w:proofErr w:type="spellEnd"/>

</xml_diff>